<commit_message>
added the 40/40 output as text as well as image
</commit_message>
<xml_diff>
--- a/programming_assignments/PA1/PA1_zuha_aqib_26106.docx
+++ b/programming_assignments/PA1/PA1_zuha_aqib_26106.docx
@@ -202,23 +202,27 @@
       <w:pPr>
         <w:rPr>
           <w:rFonts w:ascii="Times New Roman" w:hAnsi="Times New Roman" w:cs="Times New Roman"/>
-          <w:sz w:val="20"/>
-          <w:szCs w:val="20"/>
-        </w:rPr>
-      </w:pPr>
-      <w:proofErr w:type="gramStart"/>
-      <w:r>
-        <w:rPr>
-          <w:rFonts w:ascii="Times New Roman" w:hAnsi="Times New Roman" w:cs="Times New Roman"/>
-          <w:sz w:val="20"/>
-          <w:szCs w:val="20"/>
-        </w:rPr>
-        <w:t>So</w:t>
-      </w:r>
-      <w:proofErr w:type="gramEnd"/>
-      <w:r>
-        <w:rPr>
-          <w:rFonts w:ascii="Times New Roman" w:hAnsi="Times New Roman" w:cs="Times New Roman"/>
+          <w:i/>
+          <w:iCs/>
+          <w:sz w:val="20"/>
+          <w:szCs w:val="20"/>
+        </w:rPr>
+      </w:pPr>
+      <w:r>
+        <w:rPr>
+          <w:rFonts w:ascii="Times New Roman" w:hAnsi="Times New Roman" w:cs="Times New Roman"/>
+          <w:i/>
+          <w:iCs/>
+          <w:sz w:val="20"/>
+          <w:szCs w:val="20"/>
+        </w:rPr>
+        <w:t>So,</w:t>
+      </w:r>
+      <w:r>
+        <w:rPr>
+          <w:rFonts w:ascii="Times New Roman" w:hAnsi="Times New Roman" w:cs="Times New Roman"/>
+          <w:i/>
+          <w:iCs/>
           <w:sz w:val="20"/>
           <w:szCs w:val="20"/>
         </w:rPr>
@@ -227,6 +231,8 @@
       <w:r>
         <w:rPr>
           <w:rFonts w:ascii="Times New Roman" w:hAnsi="Times New Roman" w:cs="Times New Roman"/>
+          <w:i/>
+          <w:iCs/>
           <w:sz w:val="20"/>
           <w:szCs w:val="20"/>
         </w:rPr>
@@ -244,6 +250,14 @@
     </w:p>
     <w:sdt>
       <w:sdtPr>
+        <w:rPr>
+          <w:rFonts w:asciiTheme="minorHAnsi" w:eastAsiaTheme="minorHAnsi" w:hAnsiTheme="minorHAnsi" w:cstheme="minorBidi"/>
+          <w:color w:val="auto"/>
+          <w:kern w:val="2"/>
+          <w:sz w:val="24"/>
+          <w:szCs w:val="24"/>
+          <w14:ligatures w14:val="standardContextual"/>
+        </w:rPr>
         <w:id w:val="179639163"/>
         <w:docPartObj>
           <w:docPartGallery w:val="Table of Contents"/>
@@ -252,15 +266,9 @@
       </w:sdtPr>
       <w:sdtEndPr>
         <w:rPr>
-          <w:rFonts w:asciiTheme="minorHAnsi" w:eastAsiaTheme="minorHAnsi" w:hAnsiTheme="minorHAnsi" w:cstheme="minorBidi"/>
           <w:b/>
           <w:bCs/>
           <w:noProof/>
-          <w:color w:val="auto"/>
-          <w:kern w:val="2"/>
-          <w:sz w:val="24"/>
-          <w:szCs w:val="24"/>
-          <w14:ligatures w14:val="standardContextual"/>
         </w:rPr>
       </w:sdtEndPr>
       <w:sdtContent>
@@ -292,7 +300,7 @@
           <w:r>
             <w:fldChar w:fldCharType="separate"/>
           </w:r>
-          <w:hyperlink w:anchor="_Toc227337354" w:history="1">
+          <w:hyperlink w:anchor="_Toc227337843" w:history="1">
             <w:r>
               <w:rPr>
                 <w:rStyle w:val="Hyperlink"/>
@@ -319,7 +327,7 @@
                 <w:noProof/>
                 <w:webHidden/>
               </w:rPr>
-              <w:instrText xml:space="preserve"> PAGEREF _Toc227337354 \h </w:instrText>
+              <w:instrText xml:space="preserve"> PAGEREF _Toc227337843 \h </w:instrText>
             </w:r>
             <w:r>
               <w:rPr>
@@ -361,7 +369,7 @@
               <w:noProof/>
             </w:rPr>
           </w:pPr>
-          <w:hyperlink w:anchor="_Toc227337355" w:history="1">
+          <w:hyperlink w:anchor="_Toc227337844" w:history="1">
             <w:r>
               <w:rPr>
                 <w:rStyle w:val="Hyperlink"/>
@@ -388,145 +396,7 @@
                 <w:noProof/>
                 <w:webHidden/>
               </w:rPr>
-              <w:instrText xml:space="preserve"> PAGEREF _Toc227337355 \h </w:instrText>
-            </w:r>
-            <w:r>
-              <w:rPr>
-                <w:noProof/>
-                <w:webHidden/>
-              </w:rPr>
-            </w:r>
-            <w:r>
-              <w:rPr>
-                <w:noProof/>
-                <w:webHidden/>
-              </w:rPr>
-              <w:fldChar w:fldCharType="separate"/>
-            </w:r>
-            <w:r>
-              <w:rPr>
-                <w:noProof/>
-                <w:webHidden/>
-              </w:rPr>
-              <w:t>3</w:t>
-            </w:r>
-            <w:r>
-              <w:rPr>
-                <w:noProof/>
-                <w:webHidden/>
-              </w:rPr>
-              <w:fldChar w:fldCharType="end"/>
-            </w:r>
-          </w:hyperlink>
-        </w:p>
-        <w:p>
-          <w:pPr>
-            <w:pStyle w:val="TOC1"/>
-            <w:tabs>
-              <w:tab w:val="right" w:leader="dot" w:pos="9350"/>
-            </w:tabs>
-            <w:rPr>
-              <w:rFonts w:eastAsiaTheme="minorEastAsia"/>
-              <w:noProof/>
-            </w:rPr>
-          </w:pPr>
-          <w:hyperlink w:anchor="_Toc227337356" w:history="1">
-            <w:r>
-              <w:rPr>
-                <w:rStyle w:val="Hyperlink"/>
-                <w:noProof/>
-              </w:rPr>
-              <w:t>PROOF 3: chain successfully sent to backend</w:t>
-            </w:r>
-            <w:r>
-              <w:rPr>
-                <w:noProof/>
-                <w:webHidden/>
-              </w:rPr>
-              <w:tab/>
-            </w:r>
-            <w:r>
-              <w:rPr>
-                <w:noProof/>
-                <w:webHidden/>
-              </w:rPr>
-              <w:fldChar w:fldCharType="begin"/>
-            </w:r>
-            <w:r>
-              <w:rPr>
-                <w:noProof/>
-                <w:webHidden/>
-              </w:rPr>
-              <w:instrText xml:space="preserve"> PAGEREF _Toc227337356 \h </w:instrText>
-            </w:r>
-            <w:r>
-              <w:rPr>
-                <w:noProof/>
-                <w:webHidden/>
-              </w:rPr>
-            </w:r>
-            <w:r>
-              <w:rPr>
-                <w:noProof/>
-                <w:webHidden/>
-              </w:rPr>
-              <w:fldChar w:fldCharType="separate"/>
-            </w:r>
-            <w:r>
-              <w:rPr>
-                <w:noProof/>
-                <w:webHidden/>
-              </w:rPr>
-              <w:t>4</w:t>
-            </w:r>
-            <w:r>
-              <w:rPr>
-                <w:noProof/>
-                <w:webHidden/>
-              </w:rPr>
-              <w:fldChar w:fldCharType="end"/>
-            </w:r>
-          </w:hyperlink>
-        </w:p>
-        <w:p>
-          <w:pPr>
-            <w:pStyle w:val="TOC1"/>
-            <w:tabs>
-              <w:tab w:val="right" w:leader="dot" w:pos="9350"/>
-            </w:tabs>
-            <w:rPr>
-              <w:rFonts w:eastAsiaTheme="minorEastAsia"/>
-              <w:noProof/>
-            </w:rPr>
-          </w:pPr>
-          <w:hyperlink w:anchor="_Toc227337357" w:history="1">
-            <w:r>
-              <w:rPr>
-                <w:rStyle w:val="Hyperlink"/>
-                <w:noProof/>
-              </w:rPr>
-              <w:t>PROOF 4: chain fetched and printed to see if my block was added</w:t>
-            </w:r>
-            <w:r>
-              <w:rPr>
-                <w:noProof/>
-                <w:webHidden/>
-              </w:rPr>
-              <w:tab/>
-            </w:r>
-            <w:r>
-              <w:rPr>
-                <w:noProof/>
-                <w:webHidden/>
-              </w:rPr>
-              <w:fldChar w:fldCharType="begin"/>
-            </w:r>
-            <w:r>
-              <w:rPr>
-                <w:noProof/>
-                <w:webHidden/>
-              </w:rPr>
-              <w:instrText xml:space="preserve"> PAGEREF _Toc227337357 \h </w:instrText>
+              <w:instrText xml:space="preserve"> PAGEREF _Toc227337844 \h </w:instrText>
             </w:r>
             <w:r>
               <w:rPr>
@@ -568,7 +438,145 @@
               <w:noProof/>
             </w:rPr>
           </w:pPr>
-          <w:hyperlink w:anchor="_Toc227337358" w:history="1">
+          <w:hyperlink w:anchor="_Toc227337845" w:history="1">
+            <w:r>
+              <w:rPr>
+                <w:rStyle w:val="Hyperlink"/>
+                <w:noProof/>
+              </w:rPr>
+              <w:t>PROOF 3: chain successfully sent to backend</w:t>
+            </w:r>
+            <w:r>
+              <w:rPr>
+                <w:noProof/>
+                <w:webHidden/>
+              </w:rPr>
+              <w:tab/>
+            </w:r>
+            <w:r>
+              <w:rPr>
+                <w:noProof/>
+                <w:webHidden/>
+              </w:rPr>
+              <w:fldChar w:fldCharType="begin"/>
+            </w:r>
+            <w:r>
+              <w:rPr>
+                <w:noProof/>
+                <w:webHidden/>
+              </w:rPr>
+              <w:instrText xml:space="preserve"> PAGEREF _Toc227337845 \h </w:instrText>
+            </w:r>
+            <w:r>
+              <w:rPr>
+                <w:noProof/>
+                <w:webHidden/>
+              </w:rPr>
+            </w:r>
+            <w:r>
+              <w:rPr>
+                <w:noProof/>
+                <w:webHidden/>
+              </w:rPr>
+              <w:fldChar w:fldCharType="separate"/>
+            </w:r>
+            <w:r>
+              <w:rPr>
+                <w:noProof/>
+                <w:webHidden/>
+              </w:rPr>
+              <w:t>6</w:t>
+            </w:r>
+            <w:r>
+              <w:rPr>
+                <w:noProof/>
+                <w:webHidden/>
+              </w:rPr>
+              <w:fldChar w:fldCharType="end"/>
+            </w:r>
+          </w:hyperlink>
+        </w:p>
+        <w:p>
+          <w:pPr>
+            <w:pStyle w:val="TOC1"/>
+            <w:tabs>
+              <w:tab w:val="right" w:leader="dot" w:pos="9350"/>
+            </w:tabs>
+            <w:rPr>
+              <w:rFonts w:eastAsiaTheme="minorEastAsia"/>
+              <w:noProof/>
+            </w:rPr>
+          </w:pPr>
+          <w:hyperlink w:anchor="_Toc227337846" w:history="1">
+            <w:r>
+              <w:rPr>
+                <w:rStyle w:val="Hyperlink"/>
+                <w:noProof/>
+              </w:rPr>
+              <w:t>PROOF 4: chain fetched and printed to see if my block was added</w:t>
+            </w:r>
+            <w:r>
+              <w:rPr>
+                <w:noProof/>
+                <w:webHidden/>
+              </w:rPr>
+              <w:tab/>
+            </w:r>
+            <w:r>
+              <w:rPr>
+                <w:noProof/>
+                <w:webHidden/>
+              </w:rPr>
+              <w:fldChar w:fldCharType="begin"/>
+            </w:r>
+            <w:r>
+              <w:rPr>
+                <w:noProof/>
+                <w:webHidden/>
+              </w:rPr>
+              <w:instrText xml:space="preserve"> PAGEREF _Toc227337846 \h </w:instrText>
+            </w:r>
+            <w:r>
+              <w:rPr>
+                <w:noProof/>
+                <w:webHidden/>
+              </w:rPr>
+            </w:r>
+            <w:r>
+              <w:rPr>
+                <w:noProof/>
+                <w:webHidden/>
+              </w:rPr>
+              <w:fldChar w:fldCharType="separate"/>
+            </w:r>
+            <w:r>
+              <w:rPr>
+                <w:noProof/>
+                <w:webHidden/>
+              </w:rPr>
+              <w:t>7</w:t>
+            </w:r>
+            <w:r>
+              <w:rPr>
+                <w:noProof/>
+                <w:webHidden/>
+              </w:rPr>
+              <w:fldChar w:fldCharType="end"/>
+            </w:r>
+          </w:hyperlink>
+        </w:p>
+        <w:p>
+          <w:pPr>
+            <w:pStyle w:val="TOC1"/>
+            <w:tabs>
+              <w:tab w:val="right" w:leader="dot" w:pos="9350"/>
+            </w:tabs>
+            <w:rPr>
+              <w:rFonts w:eastAsiaTheme="minorEastAsia"/>
+              <w:noProof/>
+            </w:rPr>
+          </w:pPr>
+          <w:hyperlink w:anchor="_Toc227337847" w:history="1">
             <w:r>
               <w:rPr>
                 <w:rStyle w:val="Hyperlink"/>
@@ -595,7 +603,7 @@
                 <w:noProof/>
                 <w:webHidden/>
               </w:rPr>
-              <w:instrText xml:space="preserve"> PAGEREF _Toc227337358 \h </w:instrText>
+              <w:instrText xml:space="preserve"> PAGEREF _Toc227337847 \h </w:instrText>
             </w:r>
             <w:r>
               <w:rPr>
@@ -615,7 +623,7 @@
                 <w:noProof/>
                 <w:webHidden/>
               </w:rPr>
-              <w:t>5</w:t>
+              <w:t>7</w:t>
             </w:r>
             <w:r>
               <w:rPr>
@@ -668,7 +676,7 @@
       <w:pPr>
         <w:pStyle w:val="Heading1"/>
       </w:pPr>
-      <w:bookmarkStart w:id="0" w:name="_Toc227337354"/>
+      <w:bookmarkStart w:id="0" w:name="_Toc227337843"/>
       <w:r>
         <w:rPr>
           <w:u w:val="single"/>
@@ -861,12 +869,1010 @@
           <w:sz w:val="20"/>
           <w:szCs w:val="20"/>
         </w:rPr>
+        <w:t>&gt; python testCode.py</w:t>
+      </w:r>
+    </w:p>
+    <w:p>
+      <w:pPr>
+        <w:rPr>
+          <w:rFonts w:ascii="Times New Roman" w:hAnsi="Times New Roman" w:cs="Times New Roman"/>
+          <w:sz w:val="20"/>
+          <w:szCs w:val="20"/>
+        </w:rPr>
+      </w:pPr>
+      <w:r>
+        <w:rPr>
+          <w:rFonts w:ascii="Times New Roman" w:hAnsi="Times New Roman" w:cs="Times New Roman"/>
+          <w:sz w:val="20"/>
+          <w:szCs w:val="20"/>
+        </w:rPr>
+        <w:t xml:space="preserve">Enter your </w:t>
+      </w:r>
+      <w:proofErr w:type="spellStart"/>
+      <w:r>
+        <w:rPr>
+          <w:rFonts w:ascii="Times New Roman" w:hAnsi="Times New Roman" w:cs="Times New Roman"/>
+          <w:sz w:val="20"/>
+          <w:szCs w:val="20"/>
+        </w:rPr>
+        <w:t>erp</w:t>
+      </w:r>
+      <w:proofErr w:type="spellEnd"/>
+      <w:r>
+        <w:rPr>
+          <w:rFonts w:ascii="Times New Roman" w:hAnsi="Times New Roman" w:cs="Times New Roman"/>
+          <w:sz w:val="20"/>
+          <w:szCs w:val="20"/>
+        </w:rPr>
+        <w:t xml:space="preserve"> id: 26106</w:t>
+      </w:r>
+    </w:p>
+    <w:p>
+      <w:pPr>
+        <w:rPr>
+          <w:rFonts w:ascii="Times New Roman" w:hAnsi="Times New Roman" w:cs="Times New Roman"/>
+          <w:sz w:val="20"/>
+          <w:szCs w:val="20"/>
+        </w:rPr>
+      </w:pPr>
+      <w:r>
+        <w:rPr>
+          <w:rFonts w:ascii="Times New Roman" w:hAnsi="Times New Roman" w:cs="Times New Roman"/>
+          <w:sz w:val="20"/>
+          <w:szCs w:val="20"/>
+        </w:rPr>
+        <w:t>Connected to backend</w:t>
+      </w:r>
+    </w:p>
+    <w:p>
+      <w:pPr>
+        <w:rPr>
+          <w:rFonts w:ascii="Times New Roman" w:hAnsi="Times New Roman" w:cs="Times New Roman"/>
+          <w:sz w:val="20"/>
+          <w:szCs w:val="20"/>
+        </w:rPr>
+      </w:pPr>
+      <w:r>
+        <w:rPr>
+          <w:rFonts w:ascii="Times New Roman" w:hAnsi="Times New Roman" w:cs="Times New Roman"/>
+          <w:sz w:val="20"/>
+          <w:szCs w:val="20"/>
+        </w:rPr>
+        <w:t>9889 9889 5</w:t>
+      </w:r>
+    </w:p>
+    <w:p>
+      <w:pPr>
+        <w:rPr>
+          <w:rFonts w:ascii="Times New Roman" w:hAnsi="Times New Roman" w:cs="Times New Roman"/>
+          <w:sz w:val="20"/>
+          <w:szCs w:val="20"/>
+        </w:rPr>
+      </w:pPr>
+      <w:r>
+        <w:rPr>
+          <w:rFonts w:ascii="Times New Roman" w:hAnsi="Times New Roman" w:cs="Times New Roman"/>
+          <w:sz w:val="20"/>
+          <w:szCs w:val="20"/>
+        </w:rPr>
+        <w:t>870957153513604955099783510612415718372330343087099090278033937281925992370 0</w:t>
+      </w:r>
+    </w:p>
+    <w:p>
+      <w:pPr>
+        <w:rPr>
+          <w:rFonts w:ascii="Times New Roman" w:hAnsi="Times New Roman" w:cs="Times New Roman"/>
+          <w:sz w:val="20"/>
+          <w:szCs w:val="20"/>
+        </w:rPr>
+      </w:pPr>
+      <w:r>
+        <w:rPr>
+          <w:rFonts w:ascii="Times New Roman" w:hAnsi="Times New Roman" w:cs="Times New Roman"/>
+          <w:sz w:val="20"/>
+          <w:szCs w:val="20"/>
+        </w:rPr>
+        <w:t>25710847192128860711870250207729231661178476158772968986907201458313275253420 0</w:t>
+      </w:r>
+    </w:p>
+    <w:p>
+      <w:pPr>
+        <w:rPr>
+          <w:rFonts w:ascii="Times New Roman" w:hAnsi="Times New Roman" w:cs="Times New Roman"/>
+          <w:sz w:val="20"/>
+          <w:szCs w:val="20"/>
+        </w:rPr>
+      </w:pPr>
+      <w:r>
+        <w:rPr>
+          <w:rFonts w:ascii="Times New Roman" w:hAnsi="Times New Roman" w:cs="Times New Roman"/>
+          <w:sz w:val="20"/>
+          <w:szCs w:val="20"/>
+        </w:rPr>
+        <w:t>40189016485892926282548271016069919390207554076965828391660538936131874139403 0</w:t>
+      </w:r>
+    </w:p>
+    <w:p>
+      <w:pPr>
+        <w:rPr>
+          <w:rFonts w:ascii="Times New Roman" w:hAnsi="Times New Roman" w:cs="Times New Roman"/>
+          <w:sz w:val="20"/>
+          <w:szCs w:val="20"/>
+        </w:rPr>
+      </w:pPr>
+      <w:r>
+        <w:rPr>
+          <w:rFonts w:ascii="Times New Roman" w:hAnsi="Times New Roman" w:cs="Times New Roman"/>
+          <w:sz w:val="20"/>
+          <w:szCs w:val="20"/>
+        </w:rPr>
+        <w:t>43558234995138531315276814253345165558232202230712793313817517100022236863201 0</w:t>
+      </w:r>
+    </w:p>
+    <w:p>
+      <w:pPr>
+        <w:rPr>
+          <w:rFonts w:ascii="Times New Roman" w:hAnsi="Times New Roman" w:cs="Times New Roman"/>
+          <w:sz w:val="20"/>
+          <w:szCs w:val="20"/>
+        </w:rPr>
+      </w:pPr>
+      <w:r>
+        <w:rPr>
+          <w:rFonts w:ascii="Times New Roman" w:hAnsi="Times New Roman" w:cs="Times New Roman"/>
+          <w:sz w:val="20"/>
+          <w:szCs w:val="20"/>
+        </w:rPr>
+        <w:t>61368317325581018485444567640877575581714997222663672800401752329642593681898 0</w:t>
+      </w:r>
+    </w:p>
+    <w:p>
+      <w:pPr>
+        <w:rPr>
+          <w:rFonts w:ascii="Times New Roman" w:hAnsi="Times New Roman" w:cs="Times New Roman"/>
+          <w:sz w:val="20"/>
+          <w:szCs w:val="20"/>
+        </w:rPr>
+      </w:pPr>
+      <w:r>
+        <w:rPr>
+          <w:rFonts w:ascii="Times New Roman" w:hAnsi="Times New Roman" w:cs="Times New Roman"/>
+          <w:sz w:val="20"/>
+          <w:szCs w:val="20"/>
+        </w:rPr>
+        <w:t>68957154921550612234866922340053330019704169724720129011905449946148775763014 0</w:t>
+      </w:r>
+    </w:p>
+    <w:p>
+      <w:pPr>
+        <w:rPr>
+          <w:rFonts w:ascii="Times New Roman" w:hAnsi="Times New Roman" w:cs="Times New Roman"/>
+          <w:sz w:val="20"/>
+          <w:szCs w:val="20"/>
+        </w:rPr>
+      </w:pPr>
+      <w:r>
+        <w:rPr>
+          <w:rFonts w:ascii="Times New Roman" w:hAnsi="Times New Roman" w:cs="Times New Roman"/>
+          <w:sz w:val="20"/>
+          <w:szCs w:val="20"/>
+        </w:rPr>
+        <w:t>85128033328377724622986738793818727043753474774787377171671560282379194970854 0</w:t>
+      </w:r>
+    </w:p>
+    <w:p>
+      <w:pPr>
+        <w:rPr>
+          <w:rFonts w:ascii="Times New Roman" w:hAnsi="Times New Roman" w:cs="Times New Roman"/>
+          <w:sz w:val="20"/>
+          <w:szCs w:val="20"/>
+        </w:rPr>
+      </w:pPr>
+      <w:r>
+        <w:rPr>
+          <w:rFonts w:ascii="Times New Roman" w:hAnsi="Times New Roman" w:cs="Times New Roman"/>
+          <w:sz w:val="20"/>
+          <w:szCs w:val="20"/>
+        </w:rPr>
+        <w:t>87316322514699652727249331442542001328835646615455141794091667247614728216777 0</w:t>
+      </w:r>
+    </w:p>
+    <w:p>
+      <w:pPr>
+        <w:rPr>
+          <w:rFonts w:ascii="Times New Roman" w:hAnsi="Times New Roman" w:cs="Times New Roman"/>
+          <w:sz w:val="20"/>
+          <w:szCs w:val="20"/>
+        </w:rPr>
+      </w:pPr>
+      <w:r>
+        <w:rPr>
+          <w:rFonts w:ascii="Times New Roman" w:hAnsi="Times New Roman" w:cs="Times New Roman"/>
+          <w:sz w:val="20"/>
+          <w:szCs w:val="20"/>
+        </w:rPr>
+        <w:t>97900424532147900438859704322823053922997230128479610197495596665802299846947 5000000000</w:t>
+      </w:r>
+    </w:p>
+    <w:p>
+      <w:pPr>
+        <w:rPr>
+          <w:rFonts w:ascii="Times New Roman" w:hAnsi="Times New Roman" w:cs="Times New Roman"/>
+          <w:sz w:val="20"/>
+          <w:szCs w:val="20"/>
+        </w:rPr>
+      </w:pPr>
+      <w:r>
+        <w:rPr>
+          <w:rFonts w:ascii="Times New Roman" w:hAnsi="Times New Roman" w:cs="Times New Roman"/>
+          <w:sz w:val="20"/>
+          <w:szCs w:val="20"/>
+        </w:rPr>
+        <w:lastRenderedPageBreak/>
+        <w:t>99652275076723255094766834832004149220812205664595801229873801477016512014599 0</w:t>
+      </w:r>
+    </w:p>
+    <w:p>
+      <w:pPr>
+        <w:rPr>
+          <w:rFonts w:ascii="Times New Roman" w:hAnsi="Times New Roman" w:cs="Times New Roman"/>
+          <w:sz w:val="20"/>
+          <w:szCs w:val="20"/>
+        </w:rPr>
+      </w:pPr>
+      <w:r>
+        <w:rPr>
+          <w:rFonts w:ascii="Times New Roman" w:hAnsi="Times New Roman" w:cs="Times New Roman"/>
+          <w:sz w:val="20"/>
+          <w:szCs w:val="20"/>
+        </w:rPr>
+        <w:t>870957153513604955099783510612415718372330343087099090278033937281925992370 5000000000</w:t>
+      </w:r>
+    </w:p>
+    <w:p>
+      <w:pPr>
+        <w:rPr>
+          <w:rFonts w:ascii="Times New Roman" w:hAnsi="Times New Roman" w:cs="Times New Roman"/>
+          <w:sz w:val="20"/>
+          <w:szCs w:val="20"/>
+        </w:rPr>
+      </w:pPr>
+      <w:r>
+        <w:rPr>
+          <w:rFonts w:ascii="Times New Roman" w:hAnsi="Times New Roman" w:cs="Times New Roman"/>
+          <w:sz w:val="20"/>
+          <w:szCs w:val="20"/>
+        </w:rPr>
+        <w:t>25710847192128860711870250207729231661178476158772968986907201458313275253420 5000000000</w:t>
+      </w:r>
+    </w:p>
+    <w:p>
+      <w:pPr>
+        <w:rPr>
+          <w:rFonts w:ascii="Times New Roman" w:hAnsi="Times New Roman" w:cs="Times New Roman"/>
+          <w:sz w:val="20"/>
+          <w:szCs w:val="20"/>
+        </w:rPr>
+      </w:pPr>
+      <w:r>
+        <w:rPr>
+          <w:rFonts w:ascii="Times New Roman" w:hAnsi="Times New Roman" w:cs="Times New Roman"/>
+          <w:sz w:val="20"/>
+          <w:szCs w:val="20"/>
+        </w:rPr>
+        <w:t>40189016485892926282548271016069919390207554076965828391660538936131874139403 5000000000</w:t>
+      </w:r>
+    </w:p>
+    <w:p>
+      <w:pPr>
+        <w:rPr>
+          <w:rFonts w:ascii="Times New Roman" w:hAnsi="Times New Roman" w:cs="Times New Roman"/>
+          <w:sz w:val="20"/>
+          <w:szCs w:val="20"/>
+        </w:rPr>
+      </w:pPr>
+      <w:r>
+        <w:rPr>
+          <w:rFonts w:ascii="Times New Roman" w:hAnsi="Times New Roman" w:cs="Times New Roman"/>
+          <w:sz w:val="20"/>
+          <w:szCs w:val="20"/>
+        </w:rPr>
+        <w:t>43558234995138531315276814253345165558232202230712793313817517100022236863201 5000000000</w:t>
+      </w:r>
+    </w:p>
+    <w:p>
+      <w:pPr>
+        <w:rPr>
+          <w:rFonts w:ascii="Times New Roman" w:hAnsi="Times New Roman" w:cs="Times New Roman"/>
+          <w:sz w:val="20"/>
+          <w:szCs w:val="20"/>
+        </w:rPr>
+      </w:pPr>
+      <w:r>
+        <w:rPr>
+          <w:rFonts w:ascii="Times New Roman" w:hAnsi="Times New Roman" w:cs="Times New Roman"/>
+          <w:sz w:val="20"/>
+          <w:szCs w:val="20"/>
+        </w:rPr>
+        <w:t>61368317325581018485444567640877575581714997222663672800401752329642593681898 5000000000</w:t>
+      </w:r>
+    </w:p>
+    <w:p>
+      <w:pPr>
+        <w:rPr>
+          <w:rFonts w:ascii="Times New Roman" w:hAnsi="Times New Roman" w:cs="Times New Roman"/>
+          <w:sz w:val="20"/>
+          <w:szCs w:val="20"/>
+        </w:rPr>
+      </w:pPr>
+      <w:r>
+        <w:rPr>
+          <w:rFonts w:ascii="Times New Roman" w:hAnsi="Times New Roman" w:cs="Times New Roman"/>
+          <w:sz w:val="20"/>
+          <w:szCs w:val="20"/>
+        </w:rPr>
+        <w:t>68957154921550612234866922340053330019704169724720129011905449946148775763014 5000000000</w:t>
+      </w:r>
+    </w:p>
+    <w:p>
+      <w:pPr>
+        <w:rPr>
+          <w:rFonts w:ascii="Times New Roman" w:hAnsi="Times New Roman" w:cs="Times New Roman"/>
+          <w:sz w:val="20"/>
+          <w:szCs w:val="20"/>
+        </w:rPr>
+      </w:pPr>
+      <w:r>
+        <w:rPr>
+          <w:rFonts w:ascii="Times New Roman" w:hAnsi="Times New Roman" w:cs="Times New Roman"/>
+          <w:sz w:val="20"/>
+          <w:szCs w:val="20"/>
+        </w:rPr>
+        <w:t>85128033328377724622986738793818727043753474774787377171671560282379194970854 5000000000</w:t>
+      </w:r>
+    </w:p>
+    <w:p>
+      <w:pPr>
+        <w:rPr>
+          <w:rFonts w:ascii="Times New Roman" w:hAnsi="Times New Roman" w:cs="Times New Roman"/>
+          <w:sz w:val="20"/>
+          <w:szCs w:val="20"/>
+        </w:rPr>
+      </w:pPr>
+      <w:r>
+        <w:rPr>
+          <w:rFonts w:ascii="Times New Roman" w:hAnsi="Times New Roman" w:cs="Times New Roman"/>
+          <w:sz w:val="20"/>
+          <w:szCs w:val="20"/>
+        </w:rPr>
+        <w:t>87316322514699652727249331442542001328835646615455141794091667247614728216777 5000000000</w:t>
+      </w:r>
+    </w:p>
+    <w:p>
+      <w:pPr>
+        <w:rPr>
+          <w:rFonts w:ascii="Times New Roman" w:hAnsi="Times New Roman" w:cs="Times New Roman"/>
+          <w:sz w:val="20"/>
+          <w:szCs w:val="20"/>
+        </w:rPr>
+      </w:pPr>
+      <w:r>
+        <w:rPr>
+          <w:rFonts w:ascii="Times New Roman" w:hAnsi="Times New Roman" w:cs="Times New Roman"/>
+          <w:sz w:val="20"/>
+          <w:szCs w:val="20"/>
+        </w:rPr>
+        <w:t>97900424532147900438859704322823053922997230128479610197495596665802299846947 5000000000</w:t>
+      </w:r>
+    </w:p>
+    <w:p>
+      <w:pPr>
+        <w:rPr>
+          <w:rFonts w:ascii="Times New Roman" w:hAnsi="Times New Roman" w:cs="Times New Roman"/>
+          <w:sz w:val="20"/>
+          <w:szCs w:val="20"/>
+        </w:rPr>
+      </w:pPr>
+      <w:r>
+        <w:rPr>
+          <w:rFonts w:ascii="Times New Roman" w:hAnsi="Times New Roman" w:cs="Times New Roman"/>
+          <w:sz w:val="20"/>
+          <w:szCs w:val="20"/>
+        </w:rPr>
+        <w:t>99652275076723255094766834832004149220812205664595801229873801477016512014599 5000000000</w:t>
+      </w:r>
+    </w:p>
+    <w:p>
+      <w:pPr>
+        <w:rPr>
+          <w:rFonts w:ascii="Times New Roman" w:hAnsi="Times New Roman" w:cs="Times New Roman"/>
+          <w:sz w:val="20"/>
+          <w:szCs w:val="20"/>
+        </w:rPr>
+      </w:pPr>
+      <w:r>
+        <w:rPr>
+          <w:rFonts w:ascii="Times New Roman" w:hAnsi="Times New Roman" w:cs="Times New Roman"/>
+          <w:sz w:val="20"/>
+          <w:szCs w:val="20"/>
+        </w:rPr>
+        <w:t>870957153513604955099783510612415718372330343087099090278033937281925992370 5000000000</w:t>
+      </w:r>
+    </w:p>
+    <w:p>
+      <w:pPr>
+        <w:rPr>
+          <w:rFonts w:ascii="Times New Roman" w:hAnsi="Times New Roman" w:cs="Times New Roman"/>
+          <w:sz w:val="20"/>
+          <w:szCs w:val="20"/>
+        </w:rPr>
+      </w:pPr>
+      <w:r>
+        <w:rPr>
+          <w:rFonts w:ascii="Times New Roman" w:hAnsi="Times New Roman" w:cs="Times New Roman"/>
+          <w:sz w:val="20"/>
+          <w:szCs w:val="20"/>
+        </w:rPr>
+        <w:t>25710847192128860711870250207729231661178476158772968986907201458313275253420 5000000000</w:t>
+      </w:r>
+    </w:p>
+    <w:p>
+      <w:pPr>
+        <w:rPr>
+          <w:rFonts w:ascii="Times New Roman" w:hAnsi="Times New Roman" w:cs="Times New Roman"/>
+          <w:sz w:val="20"/>
+          <w:szCs w:val="20"/>
+        </w:rPr>
+      </w:pPr>
+      <w:r>
+        <w:rPr>
+          <w:rFonts w:ascii="Times New Roman" w:hAnsi="Times New Roman" w:cs="Times New Roman"/>
+          <w:sz w:val="20"/>
+          <w:szCs w:val="20"/>
+        </w:rPr>
+        <w:t>40189016485892926282548271016069919390207554076965828391660538936131874139403 5000000000</w:t>
+      </w:r>
+    </w:p>
+    <w:p>
+      <w:pPr>
+        <w:rPr>
+          <w:rFonts w:ascii="Times New Roman" w:hAnsi="Times New Roman" w:cs="Times New Roman"/>
+          <w:sz w:val="20"/>
+          <w:szCs w:val="20"/>
+        </w:rPr>
+      </w:pPr>
+      <w:r>
+        <w:rPr>
+          <w:rFonts w:ascii="Times New Roman" w:hAnsi="Times New Roman" w:cs="Times New Roman"/>
+          <w:sz w:val="20"/>
+          <w:szCs w:val="20"/>
+        </w:rPr>
+        <w:t>43558234995138531315276814253345165558232202230712793313817517100022236863201 5000000000</w:t>
+      </w:r>
+    </w:p>
+    <w:p>
+      <w:pPr>
+        <w:rPr>
+          <w:rFonts w:ascii="Times New Roman" w:hAnsi="Times New Roman" w:cs="Times New Roman"/>
+          <w:sz w:val="20"/>
+          <w:szCs w:val="20"/>
+        </w:rPr>
+      </w:pPr>
+      <w:r>
+        <w:rPr>
+          <w:rFonts w:ascii="Times New Roman" w:hAnsi="Times New Roman" w:cs="Times New Roman"/>
+          <w:sz w:val="20"/>
+          <w:szCs w:val="20"/>
+        </w:rPr>
+        <w:t>61368317325581018485444567640877575581714997222663672800401752329642593681898 9999999835</w:t>
+      </w:r>
+    </w:p>
+    <w:p>
+      <w:pPr>
+        <w:rPr>
+          <w:rFonts w:ascii="Times New Roman" w:hAnsi="Times New Roman" w:cs="Times New Roman"/>
+          <w:sz w:val="20"/>
+          <w:szCs w:val="20"/>
+        </w:rPr>
+      </w:pPr>
+      <w:r>
+        <w:rPr>
+          <w:rFonts w:ascii="Times New Roman" w:hAnsi="Times New Roman" w:cs="Times New Roman"/>
+          <w:sz w:val="20"/>
+          <w:szCs w:val="20"/>
+        </w:rPr>
+        <w:t>68957154921550612234866922340053330019704169724720129011905449946148775763014 5000000000</w:t>
+      </w:r>
+    </w:p>
+    <w:p>
+      <w:pPr>
+        <w:rPr>
+          <w:rFonts w:ascii="Times New Roman" w:hAnsi="Times New Roman" w:cs="Times New Roman"/>
+          <w:sz w:val="20"/>
+          <w:szCs w:val="20"/>
+        </w:rPr>
+      </w:pPr>
+      <w:r>
+        <w:rPr>
+          <w:rFonts w:ascii="Times New Roman" w:hAnsi="Times New Roman" w:cs="Times New Roman"/>
+          <w:sz w:val="20"/>
+          <w:szCs w:val="20"/>
+        </w:rPr>
+        <w:t>85128033328377724622986738793818727043753474774787377171671560282379194970854 5000000000</w:t>
+      </w:r>
+    </w:p>
+    <w:p>
+      <w:pPr>
+        <w:rPr>
+          <w:rFonts w:ascii="Times New Roman" w:hAnsi="Times New Roman" w:cs="Times New Roman"/>
+          <w:sz w:val="20"/>
+          <w:szCs w:val="20"/>
+        </w:rPr>
+      </w:pPr>
+      <w:r>
+        <w:rPr>
+          <w:rFonts w:ascii="Times New Roman" w:hAnsi="Times New Roman" w:cs="Times New Roman"/>
+          <w:sz w:val="20"/>
+          <w:szCs w:val="20"/>
+        </w:rPr>
+        <w:t>87316322514699652727249331442542001328835646615455141794091667247614728216777 5000000000</w:t>
+      </w:r>
+    </w:p>
+    <w:p>
+      <w:pPr>
+        <w:rPr>
+          <w:rFonts w:ascii="Times New Roman" w:hAnsi="Times New Roman" w:cs="Times New Roman"/>
+          <w:sz w:val="20"/>
+          <w:szCs w:val="20"/>
+        </w:rPr>
+      </w:pPr>
+      <w:r>
+        <w:rPr>
+          <w:rFonts w:ascii="Times New Roman" w:hAnsi="Times New Roman" w:cs="Times New Roman"/>
+          <w:sz w:val="20"/>
+          <w:szCs w:val="20"/>
+        </w:rPr>
+        <w:t>97900424532147900438859704322823053922997230128479610197495596665802299846947 0</w:t>
+      </w:r>
+    </w:p>
+    <w:p>
+      <w:pPr>
+        <w:rPr>
+          <w:rFonts w:ascii="Times New Roman" w:hAnsi="Times New Roman" w:cs="Times New Roman"/>
+          <w:sz w:val="20"/>
+          <w:szCs w:val="20"/>
+        </w:rPr>
+      </w:pPr>
+      <w:r>
+        <w:rPr>
+          <w:rFonts w:ascii="Times New Roman" w:hAnsi="Times New Roman" w:cs="Times New Roman"/>
+          <w:sz w:val="20"/>
+          <w:szCs w:val="20"/>
+        </w:rPr>
+        <w:t>99652275076723255094766834832004149220812205664595801229873801477016512014599 5000000000</w:t>
+      </w:r>
+    </w:p>
+    <w:p>
+      <w:pPr>
+        <w:rPr>
+          <w:rFonts w:ascii="Times New Roman" w:hAnsi="Times New Roman" w:cs="Times New Roman"/>
+          <w:sz w:val="20"/>
+          <w:szCs w:val="20"/>
+        </w:rPr>
+      </w:pPr>
+      <w:r>
+        <w:rPr>
+          <w:rFonts w:ascii="Times New Roman" w:hAnsi="Times New Roman" w:cs="Times New Roman"/>
+          <w:sz w:val="20"/>
+          <w:szCs w:val="20"/>
+        </w:rPr>
+        <w:t>870957153513604955099783510612415718372330343087099090278033937281925992370 5000000000</w:t>
+      </w:r>
+    </w:p>
+    <w:p>
+      <w:pPr>
+        <w:rPr>
+          <w:rFonts w:ascii="Times New Roman" w:hAnsi="Times New Roman" w:cs="Times New Roman"/>
+          <w:sz w:val="20"/>
+          <w:szCs w:val="20"/>
+        </w:rPr>
+      </w:pPr>
+      <w:r>
+        <w:rPr>
+          <w:rFonts w:ascii="Times New Roman" w:hAnsi="Times New Roman" w:cs="Times New Roman"/>
+          <w:sz w:val="20"/>
+          <w:szCs w:val="20"/>
+        </w:rPr>
+        <w:t>25710847192128860711870250207729231661178476158772968986907201458313275253420 7969690844</w:t>
+      </w:r>
+    </w:p>
+    <w:p>
+      <w:pPr>
+        <w:rPr>
+          <w:rFonts w:ascii="Times New Roman" w:hAnsi="Times New Roman" w:cs="Times New Roman"/>
+          <w:sz w:val="20"/>
+          <w:szCs w:val="20"/>
+        </w:rPr>
+      </w:pPr>
+      <w:r>
+        <w:rPr>
+          <w:rFonts w:ascii="Times New Roman" w:hAnsi="Times New Roman" w:cs="Times New Roman"/>
+          <w:sz w:val="20"/>
+          <w:szCs w:val="20"/>
+        </w:rPr>
+        <w:t>40189016485892926282548271016069919390207554076965828391660538936131874139403 8573843577</w:t>
+      </w:r>
+    </w:p>
+    <w:p>
+      <w:pPr>
+        <w:rPr>
+          <w:rFonts w:ascii="Times New Roman" w:hAnsi="Times New Roman" w:cs="Times New Roman"/>
+          <w:sz w:val="20"/>
+          <w:szCs w:val="20"/>
+        </w:rPr>
+      </w:pPr>
+      <w:r>
+        <w:rPr>
+          <w:rFonts w:ascii="Times New Roman" w:hAnsi="Times New Roman" w:cs="Times New Roman"/>
+          <w:sz w:val="20"/>
+          <w:szCs w:val="20"/>
+        </w:rPr>
+        <w:t>43558234995138531315276814253345165558232202230712793313817517100022236863201 5000000000</w:t>
+      </w:r>
+    </w:p>
+    <w:p>
+      <w:pPr>
+        <w:rPr>
+          <w:rFonts w:ascii="Times New Roman" w:hAnsi="Times New Roman" w:cs="Times New Roman"/>
+          <w:sz w:val="20"/>
+          <w:szCs w:val="20"/>
+        </w:rPr>
+      </w:pPr>
+      <w:r>
+        <w:rPr>
+          <w:rFonts w:ascii="Times New Roman" w:hAnsi="Times New Roman" w:cs="Times New Roman"/>
+          <w:sz w:val="20"/>
+          <w:szCs w:val="20"/>
+        </w:rPr>
+        <w:t>61368317325581018485444567640877575581714997222663672800401752329642593681898 11524896630</w:t>
+      </w:r>
+    </w:p>
+    <w:p>
+      <w:pPr>
+        <w:rPr>
+          <w:rFonts w:ascii="Times New Roman" w:hAnsi="Times New Roman" w:cs="Times New Roman"/>
+          <w:sz w:val="20"/>
+          <w:szCs w:val="20"/>
+        </w:rPr>
+      </w:pPr>
+      <w:r>
+        <w:rPr>
+          <w:rFonts w:ascii="Times New Roman" w:hAnsi="Times New Roman" w:cs="Times New Roman"/>
+          <w:sz w:val="20"/>
+          <w:szCs w:val="20"/>
+        </w:rPr>
+        <w:t>68957154921550612234866922340053330019704169724720129011905449946148775763014 6426155594</w:t>
+      </w:r>
+    </w:p>
+    <w:p>
+      <w:pPr>
+        <w:rPr>
+          <w:rFonts w:ascii="Times New Roman" w:hAnsi="Times New Roman" w:cs="Times New Roman"/>
+          <w:sz w:val="20"/>
+          <w:szCs w:val="20"/>
+        </w:rPr>
+      </w:pPr>
+      <w:r>
+        <w:rPr>
+          <w:rFonts w:ascii="Times New Roman" w:hAnsi="Times New Roman" w:cs="Times New Roman"/>
+          <w:sz w:val="20"/>
+          <w:szCs w:val="20"/>
+        </w:rPr>
+        <w:t>85128033328377724622986738793818727043753474774787377171671560282379194970854 0</w:t>
+      </w:r>
+    </w:p>
+    <w:p>
+      <w:pPr>
+        <w:rPr>
+          <w:rFonts w:ascii="Times New Roman" w:hAnsi="Times New Roman" w:cs="Times New Roman"/>
+          <w:sz w:val="20"/>
+          <w:szCs w:val="20"/>
+        </w:rPr>
+      </w:pPr>
+      <w:r>
+        <w:rPr>
+          <w:rFonts w:ascii="Times New Roman" w:hAnsi="Times New Roman" w:cs="Times New Roman"/>
+          <w:sz w:val="20"/>
+          <w:szCs w:val="20"/>
+        </w:rPr>
+        <w:t>87316322514699652727249331442542001328835646615455141794091667247614728216777 0</w:t>
+      </w:r>
+    </w:p>
+    <w:p>
+      <w:pPr>
+        <w:rPr>
+          <w:rFonts w:ascii="Times New Roman" w:hAnsi="Times New Roman" w:cs="Times New Roman"/>
+          <w:sz w:val="20"/>
+          <w:szCs w:val="20"/>
+        </w:rPr>
+      </w:pPr>
+      <w:r>
+        <w:rPr>
+          <w:rFonts w:ascii="Times New Roman" w:hAnsi="Times New Roman" w:cs="Times New Roman"/>
+          <w:sz w:val="20"/>
+          <w:szCs w:val="20"/>
+        </w:rPr>
+        <w:t>97900424532147900438859704322823053922997230128479610197495596665802299846947 0</w:t>
+      </w:r>
+    </w:p>
+    <w:p>
+      <w:pPr>
+        <w:rPr>
+          <w:rFonts w:ascii="Times New Roman" w:hAnsi="Times New Roman" w:cs="Times New Roman"/>
+          <w:sz w:val="20"/>
+          <w:szCs w:val="20"/>
+        </w:rPr>
+      </w:pPr>
+      <w:r>
+        <w:rPr>
+          <w:rFonts w:ascii="Times New Roman" w:hAnsi="Times New Roman" w:cs="Times New Roman"/>
+          <w:sz w:val="20"/>
+          <w:szCs w:val="20"/>
+        </w:rPr>
+        <w:lastRenderedPageBreak/>
+        <w:t>99652275076723255094766834832004149220812205664595801229873801477016512014599 5505410971</w:t>
+      </w:r>
+    </w:p>
+    <w:p>
+      <w:pPr>
+        <w:rPr>
+          <w:rFonts w:ascii="Times New Roman" w:hAnsi="Times New Roman" w:cs="Times New Roman"/>
+          <w:sz w:val="20"/>
+          <w:szCs w:val="20"/>
+        </w:rPr>
+      </w:pPr>
+      <w:proofErr w:type="gramStart"/>
+      <w:r>
+        <w:rPr>
+          <w:rFonts w:ascii="Times New Roman" w:hAnsi="Times New Roman" w:cs="Times New Roman"/>
+          <w:sz w:val="20"/>
+          <w:szCs w:val="20"/>
+        </w:rPr>
+        <w:t>Bad transaction was trying to:  43558234995138531315276814253345165558232202230712793313817517100022236863201</w:t>
+      </w:r>
+      <w:proofErr w:type="gramEnd"/>
+    </w:p>
+    <w:p>
+      <w:pPr>
+        <w:rPr>
+          <w:rFonts w:ascii="Times New Roman" w:hAnsi="Times New Roman" w:cs="Times New Roman"/>
+          <w:sz w:val="20"/>
+          <w:szCs w:val="20"/>
+        </w:rPr>
+      </w:pPr>
+      <w:r>
+        <w:rPr>
+          <w:rFonts w:ascii="Times New Roman" w:hAnsi="Times New Roman" w:cs="Times New Roman"/>
+          <w:sz w:val="20"/>
+          <w:szCs w:val="20"/>
+        </w:rPr>
+        <w:t>870957153513604955099783510612415718372330343087099090278033937281925992370 1904043603</w:t>
+      </w:r>
+    </w:p>
+    <w:p>
+      <w:pPr>
+        <w:rPr>
+          <w:rFonts w:ascii="Times New Roman" w:hAnsi="Times New Roman" w:cs="Times New Roman"/>
+          <w:sz w:val="20"/>
+          <w:szCs w:val="20"/>
+        </w:rPr>
+      </w:pPr>
+      <w:r>
+        <w:rPr>
+          <w:rFonts w:ascii="Times New Roman" w:hAnsi="Times New Roman" w:cs="Times New Roman"/>
+          <w:sz w:val="20"/>
+          <w:szCs w:val="20"/>
+        </w:rPr>
+        <w:t>25710847192128860711870250207729231661178476158772968986907201458313275253420 2531522792</w:t>
+      </w:r>
+    </w:p>
+    <w:p>
+      <w:pPr>
+        <w:rPr>
+          <w:rFonts w:ascii="Times New Roman" w:hAnsi="Times New Roman" w:cs="Times New Roman"/>
+          <w:sz w:val="20"/>
+          <w:szCs w:val="20"/>
+        </w:rPr>
+      </w:pPr>
+      <w:r>
+        <w:rPr>
+          <w:rFonts w:ascii="Times New Roman" w:hAnsi="Times New Roman" w:cs="Times New Roman"/>
+          <w:sz w:val="20"/>
+          <w:szCs w:val="20"/>
+        </w:rPr>
+        <w:t>40189016485892926282548271016069919390207554076965828391660538936131874139403 9942931921</w:t>
+      </w:r>
+    </w:p>
+    <w:p>
+      <w:pPr>
+        <w:rPr>
+          <w:rFonts w:ascii="Times New Roman" w:hAnsi="Times New Roman" w:cs="Times New Roman"/>
+          <w:sz w:val="20"/>
+          <w:szCs w:val="20"/>
+        </w:rPr>
+      </w:pPr>
+      <w:r>
+        <w:rPr>
+          <w:rFonts w:ascii="Times New Roman" w:hAnsi="Times New Roman" w:cs="Times New Roman"/>
+          <w:sz w:val="20"/>
+          <w:szCs w:val="20"/>
+        </w:rPr>
+        <w:t>43558234995138531315276814253345165558232202230712793313817517100022236863201 1792825777</w:t>
+      </w:r>
+    </w:p>
+    <w:p>
+      <w:pPr>
+        <w:rPr>
+          <w:rFonts w:ascii="Times New Roman" w:hAnsi="Times New Roman" w:cs="Times New Roman"/>
+          <w:sz w:val="20"/>
+          <w:szCs w:val="20"/>
+        </w:rPr>
+      </w:pPr>
+      <w:r>
+        <w:rPr>
+          <w:rFonts w:ascii="Times New Roman" w:hAnsi="Times New Roman" w:cs="Times New Roman"/>
+          <w:sz w:val="20"/>
+          <w:szCs w:val="20"/>
+        </w:rPr>
+        <w:t>61368317325581018485444567640877575581714997222663672800401752329642593681898 3987997543</w:t>
+      </w:r>
+    </w:p>
+    <w:p>
+      <w:pPr>
+        <w:rPr>
+          <w:rFonts w:ascii="Times New Roman" w:hAnsi="Times New Roman" w:cs="Times New Roman"/>
+          <w:sz w:val="20"/>
+          <w:szCs w:val="20"/>
+        </w:rPr>
+      </w:pPr>
+      <w:r>
+        <w:rPr>
+          <w:rFonts w:ascii="Times New Roman" w:hAnsi="Times New Roman" w:cs="Times New Roman"/>
+          <w:sz w:val="20"/>
+          <w:szCs w:val="20"/>
+        </w:rPr>
+        <w:t>68957154921550612234866922340053330019704169724720129011905449946148775763014 60512845</w:t>
+      </w:r>
+    </w:p>
+    <w:p>
+      <w:pPr>
+        <w:rPr>
+          <w:rFonts w:ascii="Times New Roman" w:hAnsi="Times New Roman" w:cs="Times New Roman"/>
+          <w:sz w:val="20"/>
+          <w:szCs w:val="20"/>
+        </w:rPr>
+      </w:pPr>
+      <w:r>
+        <w:rPr>
+          <w:rFonts w:ascii="Times New Roman" w:hAnsi="Times New Roman" w:cs="Times New Roman"/>
+          <w:sz w:val="20"/>
+          <w:szCs w:val="20"/>
+        </w:rPr>
+        <w:t>85128033328377724622986738793818727043753474774787377171671560282379194970854 13396149551</w:t>
+      </w:r>
+    </w:p>
+    <w:p>
+      <w:pPr>
+        <w:rPr>
+          <w:rFonts w:ascii="Times New Roman" w:hAnsi="Times New Roman" w:cs="Times New Roman"/>
+          <w:sz w:val="20"/>
+          <w:szCs w:val="20"/>
+        </w:rPr>
+      </w:pPr>
+      <w:r>
+        <w:rPr>
+          <w:rFonts w:ascii="Times New Roman" w:hAnsi="Times New Roman" w:cs="Times New Roman"/>
+          <w:sz w:val="20"/>
+          <w:szCs w:val="20"/>
+        </w:rPr>
+        <w:t>87316322514699652727249331442542001328835646615455141794091667247614728216777 4671489268</w:t>
+      </w:r>
+    </w:p>
+    <w:p>
+      <w:pPr>
+        <w:rPr>
+          <w:rFonts w:ascii="Times New Roman" w:hAnsi="Times New Roman" w:cs="Times New Roman"/>
+          <w:sz w:val="20"/>
+          <w:szCs w:val="20"/>
+        </w:rPr>
+      </w:pPr>
+      <w:r>
+        <w:rPr>
+          <w:rFonts w:ascii="Times New Roman" w:hAnsi="Times New Roman" w:cs="Times New Roman"/>
+          <w:sz w:val="20"/>
+          <w:szCs w:val="20"/>
+        </w:rPr>
+        <w:t>97900424532147900438859704322823053922997230128479610197495596665802299846947 47783348</w:t>
+      </w:r>
+    </w:p>
+    <w:p>
+      <w:pPr>
+        <w:rPr>
+          <w:rFonts w:ascii="Times New Roman" w:hAnsi="Times New Roman" w:cs="Times New Roman"/>
+          <w:sz w:val="20"/>
+          <w:szCs w:val="20"/>
+        </w:rPr>
+      </w:pPr>
+      <w:r>
+        <w:rPr>
+          <w:rFonts w:ascii="Times New Roman" w:hAnsi="Times New Roman" w:cs="Times New Roman"/>
+          <w:sz w:val="20"/>
+          <w:szCs w:val="20"/>
+        </w:rPr>
+        <w:t>99652275076723255094766834832004149220812205664595801229873801477016512014599 11664420824</w:t>
+      </w:r>
+    </w:p>
+    <w:p>
+      <w:pPr>
+        <w:rPr>
+          <w:rFonts w:ascii="Times New Roman" w:hAnsi="Times New Roman" w:cs="Times New Roman"/>
+          <w:sz w:val="20"/>
+          <w:szCs w:val="20"/>
+        </w:rPr>
+      </w:pPr>
+    </w:p>
+    <w:p>
+      <w:pPr>
+        <w:rPr>
+          <w:rFonts w:ascii="Times New Roman" w:hAnsi="Times New Roman" w:cs="Times New Roman"/>
+          <w:sz w:val="20"/>
+          <w:szCs w:val="20"/>
+        </w:rPr>
+      </w:pPr>
+      <w:r>
+        <w:rPr>
+          <w:rFonts w:ascii="Times New Roman" w:hAnsi="Times New Roman" w:cs="Times New Roman"/>
+          <w:sz w:val="20"/>
+          <w:szCs w:val="20"/>
+        </w:rPr>
+        <w:t>Your Marks: 40 out of 40</w:t>
+      </w:r>
+    </w:p>
+    <w:p>
+      <w:pPr>
+        <w:rPr>
+          <w:rFonts w:ascii="Times New Roman" w:hAnsi="Times New Roman" w:cs="Times New Roman"/>
+          <w:sz w:val="20"/>
+          <w:szCs w:val="20"/>
+        </w:rPr>
+      </w:pPr>
+    </w:p>
+    <w:p>
+      <w:pPr>
+        <w:rPr>
+          <w:rFonts w:ascii="Times New Roman" w:hAnsi="Times New Roman" w:cs="Times New Roman"/>
+          <w:i/>
+          <w:iCs/>
+          <w:sz w:val="20"/>
+          <w:szCs w:val="20"/>
+        </w:rPr>
+      </w:pPr>
+      <w:r>
+        <w:rPr>
+          <w:rFonts w:ascii="Times New Roman" w:hAnsi="Times New Roman" w:cs="Times New Roman"/>
+          <w:i/>
+          <w:iCs/>
+          <w:sz w:val="20"/>
+          <w:szCs w:val="20"/>
+        </w:rPr>
         <w:t>Then main.py was run, “</w:t>
       </w:r>
       <w:proofErr w:type="spellStart"/>
       <w:r>
         <w:rPr>
           <w:rFonts w:ascii="Times New Roman" w:hAnsi="Times New Roman" w:cs="Times New Roman"/>
+          <w:i/>
+          <w:iCs/>
           <w:sz w:val="20"/>
           <w:szCs w:val="20"/>
         </w:rPr>
@@ -876,6 +1882,8 @@
       <w:r>
         <w:rPr>
           <w:rFonts w:ascii="Times New Roman" w:hAnsi="Times New Roman" w:cs="Times New Roman"/>
+          <w:i/>
+          <w:iCs/>
           <w:sz w:val="20"/>
           <w:szCs w:val="20"/>
         </w:rPr>
@@ -884,11 +1892,109 @@
       <w:r>
         <w:rPr>
           <w:rFonts w:ascii="Times New Roman" w:hAnsi="Times New Roman" w:cs="Times New Roman"/>
+          <w:i/>
+          <w:iCs/>
           <w:sz w:val="20"/>
           <w:szCs w:val="20"/>
         </w:rPr>
         <w:t xml:space="preserve"> was done to print the chain. Then mining </w:t>
       </w:r>
+      <w:r>
+        <w:rPr>
+          <w:rFonts w:ascii="Times New Roman" w:hAnsi="Times New Roman" w:cs="Times New Roman"/>
+          <w:i/>
+          <w:iCs/>
+          <w:sz w:val="20"/>
+          <w:szCs w:val="20"/>
+        </w:rPr>
+        <w:t>began</w:t>
+      </w:r>
+      <w:r>
+        <w:rPr>
+          <w:rFonts w:ascii="Times New Roman" w:hAnsi="Times New Roman" w:cs="Times New Roman"/>
+          <w:i/>
+          <w:iCs/>
+          <w:sz w:val="20"/>
+          <w:szCs w:val="20"/>
+        </w:rPr>
+        <w:t xml:space="preserve">. </w:t>
+      </w:r>
+    </w:p>
+    <w:p>
+      <w:pPr>
+        <w:rPr>
+          <w:rFonts w:ascii="Times New Roman" w:hAnsi="Times New Roman" w:cs="Times New Roman"/>
+          <w:sz w:val="20"/>
+          <w:szCs w:val="20"/>
+        </w:rPr>
+      </w:pPr>
+    </w:p>
+    <w:p>
+      <w:pPr>
+        <w:pStyle w:val="Heading1"/>
+      </w:pPr>
+      <w:bookmarkStart w:id="1" w:name="_Toc227337844"/>
+      <w:r>
+        <w:rPr>
+          <w:u w:val="single"/>
+        </w:rPr>
+        <w:t>PROOF 2</w:t>
+      </w:r>
+      <w:r>
+        <w:t>: Mining was successful</w:t>
+      </w:r>
+      <w:bookmarkEnd w:id="1"/>
+    </w:p>
+    <w:p>
+      <w:pPr>
+        <w:rPr>
+          <w:rFonts w:ascii="Times New Roman" w:hAnsi="Times New Roman" w:cs="Times New Roman"/>
+          <w:sz w:val="20"/>
+          <w:szCs w:val="20"/>
+        </w:rPr>
+      </w:pPr>
+      <w:r>
+        <w:rPr>
+          <w:rFonts w:ascii="Times New Roman" w:hAnsi="Times New Roman" w:cs="Times New Roman"/>
+          <w:sz w:val="20"/>
+          <w:szCs w:val="20"/>
+        </w:rPr>
+        <w:t>&gt; mine</w:t>
+      </w:r>
+    </w:p>
+    <w:p>
+      <w:pPr>
+        <w:rPr>
+          <w:rFonts w:ascii="Times New Roman" w:hAnsi="Times New Roman" w:cs="Times New Roman"/>
+          <w:sz w:val="20"/>
+          <w:szCs w:val="20"/>
+        </w:rPr>
+      </w:pPr>
+      <w:r>
+        <w:rPr>
+          <w:rFonts w:ascii="Times New Roman" w:hAnsi="Times New Roman" w:cs="Times New Roman"/>
+          <w:sz w:val="20"/>
+          <w:szCs w:val="20"/>
+        </w:rPr>
+        <w:t>Mining... this may take a while with difficulty 4</w:t>
+      </w:r>
+    </w:p>
+    <w:p>
+      <w:pPr>
+        <w:rPr>
+          <w:rFonts w:ascii="Times New Roman" w:hAnsi="Times New Roman" w:cs="Times New Roman"/>
+          <w:sz w:val="20"/>
+          <w:szCs w:val="20"/>
+        </w:rPr>
+      </w:pPr>
+      <w:r>
+        <w:rPr>
+          <w:rFonts w:ascii="Times New Roman" w:hAnsi="Times New Roman" w:cs="Times New Roman"/>
+          <w:sz w:val="20"/>
+          <w:szCs w:val="20"/>
+        </w:rPr>
+        <w:t xml:space="preserve">Still mining... tried up to </w:t>
+      </w:r>
       <w:proofErr w:type="gramStart"/>
       <w:r>
         <w:rPr>
@@ -896,7 +2002,7 @@
           <w:sz w:val="20"/>
           <w:szCs w:val="20"/>
         </w:rPr>
-        <w:t>was begun</w:t>
+        <w:t>nonce</w:t>
       </w:r>
       <w:proofErr w:type="gramEnd"/>
       <w:r>
@@ -905,7 +2011,484 @@
           <w:sz w:val="20"/>
           <w:szCs w:val="20"/>
         </w:rPr>
-        <w:t xml:space="preserve">. </w:t>
+        <w:t xml:space="preserve"> 50000</w:t>
+      </w:r>
+    </w:p>
+    <w:p>
+      <w:pPr>
+        <w:rPr>
+          <w:rFonts w:ascii="Times New Roman" w:hAnsi="Times New Roman" w:cs="Times New Roman"/>
+          <w:sz w:val="20"/>
+          <w:szCs w:val="20"/>
+        </w:rPr>
+      </w:pPr>
+      <w:r>
+        <w:rPr>
+          <w:rFonts w:ascii="Times New Roman" w:hAnsi="Times New Roman" w:cs="Times New Roman"/>
+          <w:sz w:val="20"/>
+          <w:szCs w:val="20"/>
+        </w:rPr>
+        <w:t>Still mining... tried up to nonce 100000</w:t>
+      </w:r>
+    </w:p>
+    <w:p>
+      <w:pPr>
+        <w:rPr>
+          <w:rFonts w:ascii="Times New Roman" w:hAnsi="Times New Roman" w:cs="Times New Roman"/>
+          <w:sz w:val="20"/>
+          <w:szCs w:val="20"/>
+        </w:rPr>
+      </w:pPr>
+      <w:r>
+        <w:rPr>
+          <w:rFonts w:ascii="Times New Roman" w:hAnsi="Times New Roman" w:cs="Times New Roman"/>
+          <w:sz w:val="20"/>
+          <w:szCs w:val="20"/>
+        </w:rPr>
+        <w:t>Still mining... tried up to nonce 150000</w:t>
+      </w:r>
+    </w:p>
+    <w:p>
+      <w:pPr>
+        <w:rPr>
+          <w:rFonts w:ascii="Times New Roman" w:hAnsi="Times New Roman" w:cs="Times New Roman"/>
+          <w:sz w:val="20"/>
+          <w:szCs w:val="20"/>
+        </w:rPr>
+      </w:pPr>
+      <w:r>
+        <w:rPr>
+          <w:rFonts w:ascii="Times New Roman" w:hAnsi="Times New Roman" w:cs="Times New Roman"/>
+          <w:sz w:val="20"/>
+          <w:szCs w:val="20"/>
+        </w:rPr>
+        <w:t>Still mining... tried up to nonce 200000</w:t>
+      </w:r>
+    </w:p>
+    <w:p>
+      <w:pPr>
+        <w:rPr>
+          <w:rFonts w:ascii="Times New Roman" w:hAnsi="Times New Roman" w:cs="Times New Roman"/>
+          <w:sz w:val="20"/>
+          <w:szCs w:val="20"/>
+        </w:rPr>
+      </w:pPr>
+      <w:r>
+        <w:rPr>
+          <w:rFonts w:ascii="Times New Roman" w:hAnsi="Times New Roman" w:cs="Times New Roman"/>
+          <w:sz w:val="20"/>
+          <w:szCs w:val="20"/>
+        </w:rPr>
+        <w:t>Still mining... tried up to nonce 250000</w:t>
+      </w:r>
+    </w:p>
+    <w:p>
+      <w:pPr>
+        <w:rPr>
+          <w:rFonts w:ascii="Times New Roman" w:hAnsi="Times New Roman" w:cs="Times New Roman"/>
+          <w:sz w:val="20"/>
+          <w:szCs w:val="20"/>
+        </w:rPr>
+      </w:pPr>
+      <w:r>
+        <w:rPr>
+          <w:rFonts w:ascii="Times New Roman" w:hAnsi="Times New Roman" w:cs="Times New Roman"/>
+          <w:sz w:val="20"/>
+          <w:szCs w:val="20"/>
+        </w:rPr>
+        <w:t>Still mining... tried up to nonce 300000</w:t>
+      </w:r>
+    </w:p>
+    <w:p>
+      <w:pPr>
+        <w:rPr>
+          <w:rFonts w:ascii="Times New Roman" w:hAnsi="Times New Roman" w:cs="Times New Roman"/>
+          <w:sz w:val="20"/>
+          <w:szCs w:val="20"/>
+        </w:rPr>
+      </w:pPr>
+      <w:r>
+        <w:rPr>
+          <w:rFonts w:ascii="Times New Roman" w:hAnsi="Times New Roman" w:cs="Times New Roman"/>
+          <w:sz w:val="20"/>
+          <w:szCs w:val="20"/>
+        </w:rPr>
+        <w:t>Still mining... tried up to nonce 350000</w:t>
+      </w:r>
+    </w:p>
+    <w:p>
+      <w:pPr>
+        <w:rPr>
+          <w:rFonts w:ascii="Times New Roman" w:hAnsi="Times New Roman" w:cs="Times New Roman"/>
+          <w:sz w:val="20"/>
+          <w:szCs w:val="20"/>
+        </w:rPr>
+      </w:pPr>
+      <w:r>
+        <w:rPr>
+          <w:rFonts w:ascii="Times New Roman" w:hAnsi="Times New Roman" w:cs="Times New Roman"/>
+          <w:sz w:val="20"/>
+          <w:szCs w:val="20"/>
+        </w:rPr>
+        <w:t>Still mining... tried up to nonce 400000</w:t>
+      </w:r>
+    </w:p>
+    <w:p>
+      <w:pPr>
+        <w:rPr>
+          <w:rFonts w:ascii="Times New Roman" w:hAnsi="Times New Roman" w:cs="Times New Roman"/>
+          <w:sz w:val="20"/>
+          <w:szCs w:val="20"/>
+        </w:rPr>
+      </w:pPr>
+      <w:r>
+        <w:rPr>
+          <w:rFonts w:ascii="Times New Roman" w:hAnsi="Times New Roman" w:cs="Times New Roman"/>
+          <w:sz w:val="20"/>
+          <w:szCs w:val="20"/>
+        </w:rPr>
+        <w:lastRenderedPageBreak/>
+        <w:t>Still mining... tried up to nonce 450000</w:t>
+      </w:r>
+    </w:p>
+    <w:p>
+      <w:pPr>
+        <w:rPr>
+          <w:rFonts w:ascii="Times New Roman" w:hAnsi="Times New Roman" w:cs="Times New Roman"/>
+          <w:sz w:val="20"/>
+          <w:szCs w:val="20"/>
+        </w:rPr>
+      </w:pPr>
+      <w:r>
+        <w:rPr>
+          <w:rFonts w:ascii="Times New Roman" w:hAnsi="Times New Roman" w:cs="Times New Roman"/>
+          <w:sz w:val="20"/>
+          <w:szCs w:val="20"/>
+        </w:rPr>
+        <w:t>Still mining... tried up to nonce 500000</w:t>
+      </w:r>
+    </w:p>
+    <w:p>
+      <w:pPr>
+        <w:rPr>
+          <w:rFonts w:ascii="Times New Roman" w:hAnsi="Times New Roman" w:cs="Times New Roman"/>
+          <w:sz w:val="20"/>
+          <w:szCs w:val="20"/>
+        </w:rPr>
+      </w:pPr>
+      <w:r>
+        <w:rPr>
+          <w:rFonts w:ascii="Times New Roman" w:hAnsi="Times New Roman" w:cs="Times New Roman"/>
+          <w:sz w:val="20"/>
+          <w:szCs w:val="20"/>
+        </w:rPr>
+        <w:t>Still mining... tried up to nonce 550000</w:t>
+      </w:r>
+    </w:p>
+    <w:p>
+      <w:pPr>
+        <w:rPr>
+          <w:rFonts w:ascii="Times New Roman" w:hAnsi="Times New Roman" w:cs="Times New Roman"/>
+          <w:sz w:val="20"/>
+          <w:szCs w:val="20"/>
+        </w:rPr>
+      </w:pPr>
+      <w:r>
+        <w:rPr>
+          <w:rFonts w:ascii="Times New Roman" w:hAnsi="Times New Roman" w:cs="Times New Roman"/>
+          <w:sz w:val="20"/>
+          <w:szCs w:val="20"/>
+        </w:rPr>
+        <w:t>Still mining... tried up to nonce 600000</w:t>
+      </w:r>
+    </w:p>
+    <w:p>
+      <w:pPr>
+        <w:rPr>
+          <w:rFonts w:ascii="Times New Roman" w:hAnsi="Times New Roman" w:cs="Times New Roman"/>
+          <w:sz w:val="20"/>
+          <w:szCs w:val="20"/>
+        </w:rPr>
+      </w:pPr>
+      <w:r>
+        <w:rPr>
+          <w:rFonts w:ascii="Times New Roman" w:hAnsi="Times New Roman" w:cs="Times New Roman"/>
+          <w:sz w:val="20"/>
+          <w:szCs w:val="20"/>
+        </w:rPr>
+        <w:t>Still mining... tried up to nonce 650000</w:t>
+      </w:r>
+    </w:p>
+    <w:p>
+      <w:pPr>
+        <w:rPr>
+          <w:rFonts w:ascii="Times New Roman" w:hAnsi="Times New Roman" w:cs="Times New Roman"/>
+          <w:sz w:val="20"/>
+          <w:szCs w:val="20"/>
+        </w:rPr>
+      </w:pPr>
+      <w:r>
+        <w:rPr>
+          <w:rFonts w:ascii="Times New Roman" w:hAnsi="Times New Roman" w:cs="Times New Roman"/>
+          <w:sz w:val="20"/>
+          <w:szCs w:val="20"/>
+        </w:rPr>
+        <w:t>Still mining... tried up to nonce 700000</w:t>
+      </w:r>
+    </w:p>
+    <w:p>
+      <w:pPr>
+        <w:rPr>
+          <w:rFonts w:ascii="Times New Roman" w:hAnsi="Times New Roman" w:cs="Times New Roman"/>
+          <w:sz w:val="20"/>
+          <w:szCs w:val="20"/>
+        </w:rPr>
+      </w:pPr>
+      <w:r>
+        <w:rPr>
+          <w:rFonts w:ascii="Times New Roman" w:hAnsi="Times New Roman" w:cs="Times New Roman"/>
+          <w:sz w:val="20"/>
+          <w:szCs w:val="20"/>
+        </w:rPr>
+        <w:t>Still mining... tried up to nonce 750000</w:t>
+      </w:r>
+    </w:p>
+    <w:p>
+      <w:pPr>
+        <w:rPr>
+          <w:rFonts w:ascii="Times New Roman" w:hAnsi="Times New Roman" w:cs="Times New Roman"/>
+          <w:sz w:val="20"/>
+          <w:szCs w:val="20"/>
+        </w:rPr>
+      </w:pPr>
+      <w:r>
+        <w:rPr>
+          <w:rFonts w:ascii="Times New Roman" w:hAnsi="Times New Roman" w:cs="Times New Roman"/>
+          <w:sz w:val="20"/>
+          <w:szCs w:val="20"/>
+        </w:rPr>
+        <w:t>Still mining... tried up to nonce 800000</w:t>
+      </w:r>
+    </w:p>
+    <w:p>
+      <w:pPr>
+        <w:rPr>
+          <w:rFonts w:ascii="Times New Roman" w:hAnsi="Times New Roman" w:cs="Times New Roman"/>
+          <w:sz w:val="20"/>
+          <w:szCs w:val="20"/>
+        </w:rPr>
+      </w:pPr>
+      <w:r>
+        <w:rPr>
+          <w:rFonts w:ascii="Times New Roman" w:hAnsi="Times New Roman" w:cs="Times New Roman"/>
+          <w:sz w:val="20"/>
+          <w:szCs w:val="20"/>
+        </w:rPr>
+        <w:t>Still mining... tried up to nonce 850000</w:t>
+      </w:r>
+    </w:p>
+    <w:p>
+      <w:pPr>
+        <w:rPr>
+          <w:rFonts w:ascii="Times New Roman" w:hAnsi="Times New Roman" w:cs="Times New Roman"/>
+          <w:sz w:val="20"/>
+          <w:szCs w:val="20"/>
+        </w:rPr>
+      </w:pPr>
+      <w:r>
+        <w:rPr>
+          <w:rFonts w:ascii="Times New Roman" w:hAnsi="Times New Roman" w:cs="Times New Roman"/>
+          <w:sz w:val="20"/>
+          <w:szCs w:val="20"/>
+        </w:rPr>
+        <w:t>Still mining... tried up to nonce 900000</w:t>
+      </w:r>
+    </w:p>
+    <w:p>
+      <w:pPr>
+        <w:rPr>
+          <w:rFonts w:ascii="Times New Roman" w:hAnsi="Times New Roman" w:cs="Times New Roman"/>
+          <w:sz w:val="20"/>
+          <w:szCs w:val="20"/>
+        </w:rPr>
+      </w:pPr>
+      <w:r>
+        <w:rPr>
+          <w:rFonts w:ascii="Times New Roman" w:hAnsi="Times New Roman" w:cs="Times New Roman"/>
+          <w:sz w:val="20"/>
+          <w:szCs w:val="20"/>
+        </w:rPr>
+        <w:t>Still mining... tried up to nonce 950000</w:t>
+      </w:r>
+    </w:p>
+    <w:p>
+      <w:pPr>
+        <w:rPr>
+          <w:rFonts w:ascii="Times New Roman" w:hAnsi="Times New Roman" w:cs="Times New Roman"/>
+          <w:sz w:val="20"/>
+          <w:szCs w:val="20"/>
+        </w:rPr>
+      </w:pPr>
+      <w:r>
+        <w:rPr>
+          <w:rFonts w:ascii="Times New Roman" w:hAnsi="Times New Roman" w:cs="Times New Roman"/>
+          <w:sz w:val="20"/>
+          <w:szCs w:val="20"/>
+        </w:rPr>
+        <w:t>Still mining... tried up to nonce 1000000</w:t>
+      </w:r>
+    </w:p>
+    <w:p>
+      <w:pPr>
+        <w:rPr>
+          <w:rFonts w:ascii="Times New Roman" w:hAnsi="Times New Roman" w:cs="Times New Roman"/>
+          <w:sz w:val="20"/>
+          <w:szCs w:val="20"/>
+        </w:rPr>
+      </w:pPr>
+      <w:r>
+        <w:rPr>
+          <w:rFonts w:ascii="Times New Roman" w:hAnsi="Times New Roman" w:cs="Times New Roman"/>
+          <w:sz w:val="20"/>
+          <w:szCs w:val="20"/>
+        </w:rPr>
+        <w:t>Still mining... tried up to nonce 1050000</w:t>
+      </w:r>
+    </w:p>
+    <w:p>
+      <w:pPr>
+        <w:rPr>
+          <w:rFonts w:ascii="Times New Roman" w:hAnsi="Times New Roman" w:cs="Times New Roman"/>
+          <w:sz w:val="20"/>
+          <w:szCs w:val="20"/>
+        </w:rPr>
+      </w:pPr>
+      <w:r>
+        <w:rPr>
+          <w:rFonts w:ascii="Times New Roman" w:hAnsi="Times New Roman" w:cs="Times New Roman"/>
+          <w:sz w:val="20"/>
+          <w:szCs w:val="20"/>
+        </w:rPr>
+        <w:t>Still mining... tried up to nonce 1100000</w:t>
+      </w:r>
+    </w:p>
+    <w:p>
+      <w:pPr>
+        <w:rPr>
+          <w:rFonts w:ascii="Times New Roman" w:hAnsi="Times New Roman" w:cs="Times New Roman"/>
+          <w:sz w:val="20"/>
+          <w:szCs w:val="20"/>
+        </w:rPr>
+      </w:pPr>
+      <w:r>
+        <w:rPr>
+          <w:rFonts w:ascii="Times New Roman" w:hAnsi="Times New Roman" w:cs="Times New Roman"/>
+          <w:sz w:val="20"/>
+          <w:szCs w:val="20"/>
+        </w:rPr>
+        <w:t>Still mining... tried up to nonce 1150000</w:t>
+      </w:r>
+    </w:p>
+    <w:p>
+      <w:pPr>
+        <w:rPr>
+          <w:rFonts w:ascii="Times New Roman" w:hAnsi="Times New Roman" w:cs="Times New Roman"/>
+          <w:sz w:val="20"/>
+          <w:szCs w:val="20"/>
+        </w:rPr>
+      </w:pPr>
+      <w:r>
+        <w:rPr>
+          <w:rFonts w:ascii="Times New Roman" w:hAnsi="Times New Roman" w:cs="Times New Roman"/>
+          <w:sz w:val="20"/>
+          <w:szCs w:val="20"/>
+        </w:rPr>
+        <w:t>Still mining... tried up to nonce 1200000</w:t>
+      </w:r>
+    </w:p>
+    <w:p>
+      <w:pPr>
+        <w:rPr>
+          <w:rFonts w:ascii="Times New Roman" w:hAnsi="Times New Roman" w:cs="Times New Roman"/>
+          <w:sz w:val="20"/>
+          <w:szCs w:val="20"/>
+        </w:rPr>
+      </w:pPr>
+      <w:r>
+        <w:rPr>
+          <w:rFonts w:ascii="Times New Roman" w:hAnsi="Times New Roman" w:cs="Times New Roman"/>
+          <w:sz w:val="20"/>
+          <w:szCs w:val="20"/>
+        </w:rPr>
+        <w:t>Still mining... tried up to nonce 1250000</w:t>
+      </w:r>
+    </w:p>
+    <w:p>
+      <w:pPr>
+        <w:rPr>
+          <w:rFonts w:ascii="Times New Roman" w:hAnsi="Times New Roman" w:cs="Times New Roman"/>
+          <w:sz w:val="20"/>
+          <w:szCs w:val="20"/>
+        </w:rPr>
+      </w:pPr>
+      <w:r>
+        <w:rPr>
+          <w:rFonts w:ascii="Times New Roman" w:hAnsi="Times New Roman" w:cs="Times New Roman"/>
+          <w:sz w:val="20"/>
+          <w:szCs w:val="20"/>
+        </w:rPr>
+        <w:t>Still mining... tried up to nonce 1300000</w:t>
+      </w:r>
+    </w:p>
+    <w:p>
+      <w:pPr>
+        <w:rPr>
+          <w:rFonts w:ascii="Times New Roman" w:hAnsi="Times New Roman" w:cs="Times New Roman"/>
+          <w:sz w:val="20"/>
+          <w:szCs w:val="20"/>
+        </w:rPr>
+      </w:pPr>
+      <w:r>
+        <w:rPr>
+          <w:rFonts w:ascii="Times New Roman" w:hAnsi="Times New Roman" w:cs="Times New Roman"/>
+          <w:sz w:val="20"/>
+          <w:szCs w:val="20"/>
+        </w:rPr>
+        <w:t>block hash found</w:t>
+      </w:r>
+    </w:p>
+    <w:p>
+      <w:pPr>
+        <w:rPr>
+          <w:rFonts w:ascii="Times New Roman" w:hAnsi="Times New Roman" w:cs="Times New Roman"/>
+          <w:sz w:val="20"/>
+          <w:szCs w:val="20"/>
+        </w:rPr>
+      </w:pPr>
+      <w:r>
+        <w:rPr>
+          <w:rFonts w:ascii="Times New Roman" w:hAnsi="Times New Roman" w:cs="Times New Roman"/>
+          <w:sz w:val="20"/>
+          <w:szCs w:val="20"/>
+        </w:rPr>
+        <w:t>0000c88055d80223236e80abbffc460a381b0a5e0d492ca30f722e9ccf74b1b3</w:t>
+      </w:r>
+    </w:p>
+    <w:p>
+      <w:pPr>
+        <w:rPr>
+          <w:rFonts w:ascii="Times New Roman" w:hAnsi="Times New Roman" w:cs="Times New Roman"/>
+          <w:sz w:val="20"/>
+          <w:szCs w:val="20"/>
+        </w:rPr>
+      </w:pPr>
+      <w:r>
+        <w:rPr>
+          <w:rFonts w:ascii="Times New Roman" w:hAnsi="Times New Roman" w:cs="Times New Roman"/>
+          <w:sz w:val="20"/>
+          <w:szCs w:val="20"/>
+        </w:rPr>
+        <w:t>Block successfully mined!</w:t>
       </w:r>
     </w:p>
     <w:p>
@@ -921,562 +2504,59 @@
       <w:pPr>
         <w:pStyle w:val="Heading1"/>
       </w:pPr>
-      <w:bookmarkStart w:id="1" w:name="_Toc227337355"/>
+      <w:bookmarkStart w:id="2" w:name="_Toc227337845"/>
       <w:r>
         <w:rPr>
           <w:u w:val="single"/>
         </w:rPr>
-        <w:t>PROOF 2</w:t>
-      </w:r>
-      <w:r>
-        <w:t>: Mining was successful</w:t>
-      </w:r>
-      <w:bookmarkEnd w:id="1"/>
-    </w:p>
-    <w:p>
-      <w:pPr>
-        <w:rPr>
-          <w:rFonts w:ascii="Times New Roman" w:hAnsi="Times New Roman" w:cs="Times New Roman"/>
-          <w:sz w:val="20"/>
-          <w:szCs w:val="20"/>
-        </w:rPr>
-      </w:pPr>
-      <w:r>
-        <w:rPr>
-          <w:rFonts w:ascii="Times New Roman" w:hAnsi="Times New Roman" w:cs="Times New Roman"/>
-          <w:sz w:val="20"/>
-          <w:szCs w:val="20"/>
-        </w:rPr>
-        <w:t>&gt; mine</w:t>
-      </w:r>
-    </w:p>
-    <w:p>
-      <w:pPr>
-        <w:rPr>
-          <w:rFonts w:ascii="Times New Roman" w:hAnsi="Times New Roman" w:cs="Times New Roman"/>
-          <w:sz w:val="20"/>
-          <w:szCs w:val="20"/>
-        </w:rPr>
-      </w:pPr>
-      <w:r>
-        <w:rPr>
-          <w:rFonts w:ascii="Times New Roman" w:hAnsi="Times New Roman" w:cs="Times New Roman"/>
-          <w:sz w:val="20"/>
-          <w:szCs w:val="20"/>
-        </w:rPr>
-        <w:t>Mining... this may take a while with difficulty 4</w:t>
-      </w:r>
-    </w:p>
-    <w:p>
-      <w:pPr>
-        <w:rPr>
-          <w:rFonts w:ascii="Times New Roman" w:hAnsi="Times New Roman" w:cs="Times New Roman"/>
-          <w:sz w:val="20"/>
-          <w:szCs w:val="20"/>
-        </w:rPr>
-      </w:pPr>
-      <w:r>
-        <w:rPr>
-          <w:rFonts w:ascii="Times New Roman" w:hAnsi="Times New Roman" w:cs="Times New Roman"/>
-          <w:sz w:val="20"/>
-          <w:szCs w:val="20"/>
-        </w:rPr>
-        <w:t xml:space="preserve">Still mining... tried up to </w:t>
-      </w:r>
-      <w:proofErr w:type="gramStart"/>
-      <w:r>
-        <w:rPr>
-          <w:rFonts w:ascii="Times New Roman" w:hAnsi="Times New Roman" w:cs="Times New Roman"/>
-          <w:sz w:val="20"/>
-          <w:szCs w:val="20"/>
-        </w:rPr>
-        <w:t>nonce</w:t>
-      </w:r>
-      <w:proofErr w:type="gramEnd"/>
-      <w:r>
-        <w:rPr>
-          <w:rFonts w:ascii="Times New Roman" w:hAnsi="Times New Roman" w:cs="Times New Roman"/>
-          <w:sz w:val="20"/>
-          <w:szCs w:val="20"/>
-        </w:rPr>
-        <w:t xml:space="preserve"> 50000</w:t>
-      </w:r>
-    </w:p>
-    <w:p>
-      <w:pPr>
-        <w:rPr>
-          <w:rFonts w:ascii="Times New Roman" w:hAnsi="Times New Roman" w:cs="Times New Roman"/>
-          <w:sz w:val="20"/>
-          <w:szCs w:val="20"/>
-        </w:rPr>
-      </w:pPr>
-      <w:r>
-        <w:rPr>
-          <w:rFonts w:ascii="Times New Roman" w:hAnsi="Times New Roman" w:cs="Times New Roman"/>
-          <w:sz w:val="20"/>
-          <w:szCs w:val="20"/>
-        </w:rPr>
-        <w:t>Still mining... tried up to nonce 100000</w:t>
-      </w:r>
-    </w:p>
-    <w:p>
-      <w:pPr>
-        <w:rPr>
-          <w:rFonts w:ascii="Times New Roman" w:hAnsi="Times New Roman" w:cs="Times New Roman"/>
-          <w:sz w:val="20"/>
-          <w:szCs w:val="20"/>
-        </w:rPr>
-      </w:pPr>
-      <w:r>
-        <w:rPr>
-          <w:rFonts w:ascii="Times New Roman" w:hAnsi="Times New Roman" w:cs="Times New Roman"/>
-          <w:sz w:val="20"/>
-          <w:szCs w:val="20"/>
-        </w:rPr>
-        <w:t>Still mining... tried up to nonce 150000</w:t>
-      </w:r>
-    </w:p>
-    <w:p>
-      <w:pPr>
-        <w:rPr>
-          <w:rFonts w:ascii="Times New Roman" w:hAnsi="Times New Roman" w:cs="Times New Roman"/>
-          <w:sz w:val="20"/>
-          <w:szCs w:val="20"/>
-        </w:rPr>
-      </w:pPr>
-      <w:r>
-        <w:rPr>
-          <w:rFonts w:ascii="Times New Roman" w:hAnsi="Times New Roman" w:cs="Times New Roman"/>
-          <w:sz w:val="20"/>
-          <w:szCs w:val="20"/>
-        </w:rPr>
-        <w:t>Still mining... tried up to nonce 200000</w:t>
-      </w:r>
-    </w:p>
-    <w:p>
-      <w:pPr>
-        <w:rPr>
-          <w:rFonts w:ascii="Times New Roman" w:hAnsi="Times New Roman" w:cs="Times New Roman"/>
-          <w:sz w:val="20"/>
-          <w:szCs w:val="20"/>
-        </w:rPr>
-      </w:pPr>
-      <w:r>
-        <w:rPr>
-          <w:rFonts w:ascii="Times New Roman" w:hAnsi="Times New Roman" w:cs="Times New Roman"/>
-          <w:sz w:val="20"/>
-          <w:szCs w:val="20"/>
-        </w:rPr>
-        <w:t>Still mining... tried up to nonce 250000</w:t>
-      </w:r>
-    </w:p>
-    <w:p>
-      <w:pPr>
-        <w:rPr>
-          <w:rFonts w:ascii="Times New Roman" w:hAnsi="Times New Roman" w:cs="Times New Roman"/>
-          <w:sz w:val="20"/>
-          <w:szCs w:val="20"/>
-        </w:rPr>
-      </w:pPr>
-      <w:r>
-        <w:rPr>
-          <w:rFonts w:ascii="Times New Roman" w:hAnsi="Times New Roman" w:cs="Times New Roman"/>
-          <w:sz w:val="20"/>
-          <w:szCs w:val="20"/>
-        </w:rPr>
-        <w:t>Still mining... tried up to nonce 300000</w:t>
-      </w:r>
-    </w:p>
-    <w:p>
-      <w:pPr>
-        <w:rPr>
-          <w:rFonts w:ascii="Times New Roman" w:hAnsi="Times New Roman" w:cs="Times New Roman"/>
-          <w:sz w:val="20"/>
-          <w:szCs w:val="20"/>
-        </w:rPr>
-      </w:pPr>
-      <w:r>
-        <w:rPr>
-          <w:rFonts w:ascii="Times New Roman" w:hAnsi="Times New Roman" w:cs="Times New Roman"/>
-          <w:sz w:val="20"/>
-          <w:szCs w:val="20"/>
-        </w:rPr>
-        <w:t>Still mining... tried up to nonce 350000</w:t>
-      </w:r>
-    </w:p>
-    <w:p>
-      <w:pPr>
-        <w:rPr>
-          <w:rFonts w:ascii="Times New Roman" w:hAnsi="Times New Roman" w:cs="Times New Roman"/>
-          <w:sz w:val="20"/>
-          <w:szCs w:val="20"/>
-        </w:rPr>
-      </w:pPr>
-      <w:r>
-        <w:rPr>
-          <w:rFonts w:ascii="Times New Roman" w:hAnsi="Times New Roman" w:cs="Times New Roman"/>
-          <w:sz w:val="20"/>
-          <w:szCs w:val="20"/>
-        </w:rPr>
-        <w:lastRenderedPageBreak/>
-        <w:t>Still mining... tried up to nonce 400000</w:t>
-      </w:r>
-    </w:p>
-    <w:p>
-      <w:pPr>
-        <w:rPr>
-          <w:rFonts w:ascii="Times New Roman" w:hAnsi="Times New Roman" w:cs="Times New Roman"/>
-          <w:sz w:val="20"/>
-          <w:szCs w:val="20"/>
-        </w:rPr>
-      </w:pPr>
-      <w:r>
-        <w:rPr>
-          <w:rFonts w:ascii="Times New Roman" w:hAnsi="Times New Roman" w:cs="Times New Roman"/>
-          <w:sz w:val="20"/>
-          <w:szCs w:val="20"/>
-        </w:rPr>
-        <w:t>Still mining... tried up to nonce 450000</w:t>
-      </w:r>
-    </w:p>
-    <w:p>
-      <w:pPr>
-        <w:rPr>
-          <w:rFonts w:ascii="Times New Roman" w:hAnsi="Times New Roman" w:cs="Times New Roman"/>
-          <w:sz w:val="20"/>
-          <w:szCs w:val="20"/>
-        </w:rPr>
-      </w:pPr>
-      <w:r>
-        <w:rPr>
-          <w:rFonts w:ascii="Times New Roman" w:hAnsi="Times New Roman" w:cs="Times New Roman"/>
-          <w:sz w:val="20"/>
-          <w:szCs w:val="20"/>
-        </w:rPr>
-        <w:t>Still mining... tried up to nonce 500000</w:t>
-      </w:r>
-    </w:p>
-    <w:p>
-      <w:pPr>
-        <w:rPr>
-          <w:rFonts w:ascii="Times New Roman" w:hAnsi="Times New Roman" w:cs="Times New Roman"/>
-          <w:sz w:val="20"/>
-          <w:szCs w:val="20"/>
-        </w:rPr>
-      </w:pPr>
-      <w:r>
-        <w:rPr>
-          <w:rFonts w:ascii="Times New Roman" w:hAnsi="Times New Roman" w:cs="Times New Roman"/>
-          <w:sz w:val="20"/>
-          <w:szCs w:val="20"/>
-        </w:rPr>
-        <w:t>Still mining... tried up to nonce 550000</w:t>
-      </w:r>
-    </w:p>
-    <w:p>
-      <w:pPr>
-        <w:rPr>
-          <w:rFonts w:ascii="Times New Roman" w:hAnsi="Times New Roman" w:cs="Times New Roman"/>
-          <w:sz w:val="20"/>
-          <w:szCs w:val="20"/>
-        </w:rPr>
-      </w:pPr>
-      <w:r>
-        <w:rPr>
-          <w:rFonts w:ascii="Times New Roman" w:hAnsi="Times New Roman" w:cs="Times New Roman"/>
-          <w:sz w:val="20"/>
-          <w:szCs w:val="20"/>
-        </w:rPr>
-        <w:t>Still mining... tried up to nonce 600000</w:t>
-      </w:r>
-    </w:p>
-    <w:p>
-      <w:pPr>
-        <w:rPr>
-          <w:rFonts w:ascii="Times New Roman" w:hAnsi="Times New Roman" w:cs="Times New Roman"/>
-          <w:sz w:val="20"/>
-          <w:szCs w:val="20"/>
-        </w:rPr>
-      </w:pPr>
-      <w:r>
-        <w:rPr>
-          <w:rFonts w:ascii="Times New Roman" w:hAnsi="Times New Roman" w:cs="Times New Roman"/>
-          <w:sz w:val="20"/>
-          <w:szCs w:val="20"/>
-        </w:rPr>
-        <w:t>Still mining... tried up to nonce 650000</w:t>
-      </w:r>
-    </w:p>
-    <w:p>
-      <w:pPr>
-        <w:rPr>
-          <w:rFonts w:ascii="Times New Roman" w:hAnsi="Times New Roman" w:cs="Times New Roman"/>
-          <w:sz w:val="20"/>
-          <w:szCs w:val="20"/>
-        </w:rPr>
-      </w:pPr>
-      <w:r>
-        <w:rPr>
-          <w:rFonts w:ascii="Times New Roman" w:hAnsi="Times New Roman" w:cs="Times New Roman"/>
-          <w:sz w:val="20"/>
-          <w:szCs w:val="20"/>
-        </w:rPr>
-        <w:t>Still mining... tried up to nonce 700000</w:t>
-      </w:r>
-    </w:p>
-    <w:p>
-      <w:pPr>
-        <w:rPr>
-          <w:rFonts w:ascii="Times New Roman" w:hAnsi="Times New Roman" w:cs="Times New Roman"/>
-          <w:sz w:val="20"/>
-          <w:szCs w:val="20"/>
-        </w:rPr>
-      </w:pPr>
-      <w:r>
-        <w:rPr>
-          <w:rFonts w:ascii="Times New Roman" w:hAnsi="Times New Roman" w:cs="Times New Roman"/>
-          <w:sz w:val="20"/>
-          <w:szCs w:val="20"/>
-        </w:rPr>
-        <w:t>Still mining... tried up to nonce 750000</w:t>
-      </w:r>
-    </w:p>
-    <w:p>
-      <w:pPr>
-        <w:rPr>
-          <w:rFonts w:ascii="Times New Roman" w:hAnsi="Times New Roman" w:cs="Times New Roman"/>
-          <w:sz w:val="20"/>
-          <w:szCs w:val="20"/>
-        </w:rPr>
-      </w:pPr>
-      <w:r>
-        <w:rPr>
-          <w:rFonts w:ascii="Times New Roman" w:hAnsi="Times New Roman" w:cs="Times New Roman"/>
-          <w:sz w:val="20"/>
-          <w:szCs w:val="20"/>
-        </w:rPr>
-        <w:t>Still mining... tried up to nonce 800000</w:t>
-      </w:r>
-    </w:p>
-    <w:p>
-      <w:pPr>
-        <w:rPr>
-          <w:rFonts w:ascii="Times New Roman" w:hAnsi="Times New Roman" w:cs="Times New Roman"/>
-          <w:sz w:val="20"/>
-          <w:szCs w:val="20"/>
-        </w:rPr>
-      </w:pPr>
-      <w:r>
-        <w:rPr>
-          <w:rFonts w:ascii="Times New Roman" w:hAnsi="Times New Roman" w:cs="Times New Roman"/>
-          <w:sz w:val="20"/>
-          <w:szCs w:val="20"/>
-        </w:rPr>
-        <w:t>Still mining... tried up to nonce 850000</w:t>
-      </w:r>
-    </w:p>
-    <w:p>
-      <w:pPr>
-        <w:rPr>
-          <w:rFonts w:ascii="Times New Roman" w:hAnsi="Times New Roman" w:cs="Times New Roman"/>
-          <w:sz w:val="20"/>
-          <w:szCs w:val="20"/>
-        </w:rPr>
-      </w:pPr>
-      <w:r>
-        <w:rPr>
-          <w:rFonts w:ascii="Times New Roman" w:hAnsi="Times New Roman" w:cs="Times New Roman"/>
-          <w:sz w:val="20"/>
-          <w:szCs w:val="20"/>
-        </w:rPr>
-        <w:t>Still mining... tried up to nonce 900000</w:t>
-      </w:r>
-    </w:p>
-    <w:p>
-      <w:pPr>
-        <w:rPr>
-          <w:rFonts w:ascii="Times New Roman" w:hAnsi="Times New Roman" w:cs="Times New Roman"/>
-          <w:sz w:val="20"/>
-          <w:szCs w:val="20"/>
-        </w:rPr>
-      </w:pPr>
-      <w:r>
-        <w:rPr>
-          <w:rFonts w:ascii="Times New Roman" w:hAnsi="Times New Roman" w:cs="Times New Roman"/>
-          <w:sz w:val="20"/>
-          <w:szCs w:val="20"/>
-        </w:rPr>
-        <w:t>Still mining... tried up to nonce 950000</w:t>
-      </w:r>
-    </w:p>
-    <w:p>
-      <w:pPr>
-        <w:rPr>
-          <w:rFonts w:ascii="Times New Roman" w:hAnsi="Times New Roman" w:cs="Times New Roman"/>
-          <w:sz w:val="20"/>
-          <w:szCs w:val="20"/>
-        </w:rPr>
-      </w:pPr>
-      <w:r>
-        <w:rPr>
-          <w:rFonts w:ascii="Times New Roman" w:hAnsi="Times New Roman" w:cs="Times New Roman"/>
-          <w:sz w:val="20"/>
-          <w:szCs w:val="20"/>
-        </w:rPr>
-        <w:t>Still mining... tried up to nonce 1000000</w:t>
-      </w:r>
-    </w:p>
-    <w:p>
-      <w:pPr>
-        <w:rPr>
-          <w:rFonts w:ascii="Times New Roman" w:hAnsi="Times New Roman" w:cs="Times New Roman"/>
-          <w:sz w:val="20"/>
-          <w:szCs w:val="20"/>
-        </w:rPr>
-      </w:pPr>
-      <w:r>
-        <w:rPr>
-          <w:rFonts w:ascii="Times New Roman" w:hAnsi="Times New Roman" w:cs="Times New Roman"/>
-          <w:sz w:val="20"/>
-          <w:szCs w:val="20"/>
-        </w:rPr>
-        <w:t>Still mining... tried up to nonce 1050000</w:t>
-      </w:r>
-    </w:p>
-    <w:p>
-      <w:pPr>
-        <w:rPr>
-          <w:rFonts w:ascii="Times New Roman" w:hAnsi="Times New Roman" w:cs="Times New Roman"/>
-          <w:sz w:val="20"/>
-          <w:szCs w:val="20"/>
-        </w:rPr>
-      </w:pPr>
-      <w:r>
-        <w:rPr>
-          <w:rFonts w:ascii="Times New Roman" w:hAnsi="Times New Roman" w:cs="Times New Roman"/>
-          <w:sz w:val="20"/>
-          <w:szCs w:val="20"/>
-        </w:rPr>
-        <w:t>Still mining... tried up to nonce 1100000</w:t>
-      </w:r>
-    </w:p>
-    <w:p>
-      <w:pPr>
-        <w:rPr>
-          <w:rFonts w:ascii="Times New Roman" w:hAnsi="Times New Roman" w:cs="Times New Roman"/>
-          <w:sz w:val="20"/>
-          <w:szCs w:val="20"/>
-        </w:rPr>
-      </w:pPr>
-      <w:r>
-        <w:rPr>
-          <w:rFonts w:ascii="Times New Roman" w:hAnsi="Times New Roman" w:cs="Times New Roman"/>
-          <w:sz w:val="20"/>
-          <w:szCs w:val="20"/>
-        </w:rPr>
-        <w:t>Still mining... tried up to nonce 1150000</w:t>
-      </w:r>
-    </w:p>
-    <w:p>
-      <w:pPr>
-        <w:rPr>
-          <w:rFonts w:ascii="Times New Roman" w:hAnsi="Times New Roman" w:cs="Times New Roman"/>
-          <w:sz w:val="20"/>
-          <w:szCs w:val="20"/>
-        </w:rPr>
-      </w:pPr>
-      <w:r>
-        <w:rPr>
-          <w:rFonts w:ascii="Times New Roman" w:hAnsi="Times New Roman" w:cs="Times New Roman"/>
-          <w:sz w:val="20"/>
-          <w:szCs w:val="20"/>
-        </w:rPr>
-        <w:t>Still mining... tried up to nonce 1200000</w:t>
-      </w:r>
-    </w:p>
-    <w:p>
-      <w:pPr>
-        <w:rPr>
-          <w:rFonts w:ascii="Times New Roman" w:hAnsi="Times New Roman" w:cs="Times New Roman"/>
-          <w:sz w:val="20"/>
-          <w:szCs w:val="20"/>
-        </w:rPr>
-      </w:pPr>
-      <w:r>
-        <w:rPr>
-          <w:rFonts w:ascii="Times New Roman" w:hAnsi="Times New Roman" w:cs="Times New Roman"/>
-          <w:sz w:val="20"/>
-          <w:szCs w:val="20"/>
-        </w:rPr>
-        <w:t>Still mining... tried up to nonce 1250000</w:t>
-      </w:r>
-    </w:p>
-    <w:p>
-      <w:pPr>
-        <w:rPr>
-          <w:rFonts w:ascii="Times New Roman" w:hAnsi="Times New Roman" w:cs="Times New Roman"/>
-          <w:sz w:val="20"/>
-          <w:szCs w:val="20"/>
-        </w:rPr>
-      </w:pPr>
-      <w:r>
-        <w:rPr>
-          <w:rFonts w:ascii="Times New Roman" w:hAnsi="Times New Roman" w:cs="Times New Roman"/>
-          <w:sz w:val="20"/>
-          <w:szCs w:val="20"/>
-        </w:rPr>
-        <w:t>Still mining... tried up to nonce 1300000</w:t>
-      </w:r>
-    </w:p>
-    <w:p>
-      <w:pPr>
-        <w:rPr>
-          <w:rFonts w:ascii="Times New Roman" w:hAnsi="Times New Roman" w:cs="Times New Roman"/>
-          <w:sz w:val="20"/>
-          <w:szCs w:val="20"/>
-        </w:rPr>
-      </w:pPr>
-      <w:r>
-        <w:rPr>
-          <w:rFonts w:ascii="Times New Roman" w:hAnsi="Times New Roman" w:cs="Times New Roman"/>
-          <w:sz w:val="20"/>
-          <w:szCs w:val="20"/>
-        </w:rPr>
-        <w:t>block hash found</w:t>
-      </w:r>
-    </w:p>
-    <w:p>
-      <w:pPr>
-        <w:rPr>
-          <w:rFonts w:ascii="Times New Roman" w:hAnsi="Times New Roman" w:cs="Times New Roman"/>
-          <w:sz w:val="20"/>
-          <w:szCs w:val="20"/>
-        </w:rPr>
-      </w:pPr>
-      <w:r>
-        <w:rPr>
-          <w:rFonts w:ascii="Times New Roman" w:hAnsi="Times New Roman" w:cs="Times New Roman"/>
-          <w:sz w:val="20"/>
-          <w:szCs w:val="20"/>
-        </w:rPr>
-        <w:t>0000c88055d80223236e80abbffc460a381b0a5e0d492ca30f722e9ccf74b1b3</w:t>
-      </w:r>
-    </w:p>
-    <w:p>
-      <w:pPr>
-        <w:rPr>
-          <w:rFonts w:ascii="Times New Roman" w:hAnsi="Times New Roman" w:cs="Times New Roman"/>
-          <w:sz w:val="20"/>
-          <w:szCs w:val="20"/>
-        </w:rPr>
-      </w:pPr>
-      <w:r>
-        <w:rPr>
-          <w:rFonts w:ascii="Times New Roman" w:hAnsi="Times New Roman" w:cs="Times New Roman"/>
-          <w:sz w:val="20"/>
-          <w:szCs w:val="20"/>
-        </w:rPr>
-        <w:t>Block successfully mined!</w:t>
+        <w:t>PROOF 3</w:t>
+      </w:r>
+      <w:r>
+        <w:t xml:space="preserve">: </w:t>
+      </w:r>
+      <w:r>
+        <w:t xml:space="preserve">chain </w:t>
+      </w:r>
+      <w:r>
+        <w:t xml:space="preserve">successfully </w:t>
+      </w:r>
+      <w:r>
+        <w:t>sent to backend</w:t>
+      </w:r>
+      <w:bookmarkEnd w:id="2"/>
+    </w:p>
+    <w:p>
+      <w:pPr>
+        <w:rPr>
+          <w:rFonts w:ascii="Times New Roman" w:hAnsi="Times New Roman" w:cs="Times New Roman"/>
+          <w:sz w:val="20"/>
+          <w:szCs w:val="20"/>
+        </w:rPr>
+      </w:pPr>
+      <w:r>
+        <w:rPr>
+          <w:rFonts w:ascii="Times New Roman" w:hAnsi="Times New Roman" w:cs="Times New Roman"/>
+          <w:sz w:val="20"/>
+          <w:szCs w:val="20"/>
+        </w:rPr>
+        <w:t>&gt; send state</w:t>
+      </w:r>
+    </w:p>
+    <w:p>
+      <w:pPr>
+        <w:rPr>
+          <w:rFonts w:ascii="Times New Roman" w:hAnsi="Times New Roman" w:cs="Times New Roman"/>
+          <w:sz w:val="20"/>
+          <w:szCs w:val="20"/>
+        </w:rPr>
+      </w:pPr>
+      <w:r>
+        <w:rPr>
+          <w:rFonts w:ascii="Times New Roman" w:hAnsi="Times New Roman" w:cs="Times New Roman"/>
+          <w:sz w:val="20"/>
+          <w:szCs w:val="20"/>
+        </w:rPr>
+        <w:t>State sent to backend</w:t>
       </w:r>
     </w:p>
     <w:p>
@@ -1492,75 +2572,7 @@
       <w:pPr>
         <w:pStyle w:val="Heading1"/>
       </w:pPr>
-      <w:bookmarkStart w:id="2" w:name="_Toc227337356"/>
-      <w:r>
-        <w:rPr>
-          <w:u w:val="single"/>
-        </w:rPr>
-        <w:t>PROOF 3</w:t>
-      </w:r>
-      <w:r>
-        <w:t xml:space="preserve">: </w:t>
-      </w:r>
-      <w:r>
-        <w:t xml:space="preserve">chain </w:t>
-      </w:r>
-      <w:r>
-        <w:t xml:space="preserve">successfully </w:t>
-      </w:r>
-      <w:r>
-        <w:t>sent to backend</w:t>
-      </w:r>
-      <w:bookmarkEnd w:id="2"/>
-    </w:p>
-    <w:p>
-      <w:pPr>
-        <w:rPr>
-          <w:rFonts w:ascii="Times New Roman" w:hAnsi="Times New Roman" w:cs="Times New Roman"/>
-          <w:sz w:val="20"/>
-          <w:szCs w:val="20"/>
-        </w:rPr>
-      </w:pPr>
-      <w:r>
-        <w:rPr>
-          <w:rFonts w:ascii="Times New Roman" w:hAnsi="Times New Roman" w:cs="Times New Roman"/>
-          <w:sz w:val="20"/>
-          <w:szCs w:val="20"/>
-        </w:rPr>
-        <w:t>&gt; send state</w:t>
-      </w:r>
-    </w:p>
-    <w:p>
-      <w:pPr>
-        <w:rPr>
-          <w:rFonts w:ascii="Times New Roman" w:hAnsi="Times New Roman" w:cs="Times New Roman"/>
-          <w:sz w:val="20"/>
-          <w:szCs w:val="20"/>
-        </w:rPr>
-      </w:pPr>
-      <w:r>
-        <w:rPr>
-          <w:rFonts w:ascii="Times New Roman" w:hAnsi="Times New Roman" w:cs="Times New Roman"/>
-          <w:sz w:val="20"/>
-          <w:szCs w:val="20"/>
-        </w:rPr>
-        <w:t>State sent to backend</w:t>
-      </w:r>
-    </w:p>
-    <w:p>
-      <w:pPr>
-        <w:rPr>
-          <w:rFonts w:ascii="Times New Roman" w:hAnsi="Times New Roman" w:cs="Times New Roman"/>
-          <w:sz w:val="20"/>
-          <w:szCs w:val="20"/>
-        </w:rPr>
-      </w:pPr>
-    </w:p>
-    <w:p>
-      <w:pPr>
-        <w:pStyle w:val="Heading1"/>
-      </w:pPr>
-      <w:bookmarkStart w:id="3" w:name="_Toc227337357"/>
+      <w:bookmarkStart w:id="3" w:name="_Toc227337846"/>
       <w:r>
         <w:rPr>
           <w:u w:val="single"/>
@@ -2006,7 +3018,7 @@
       <w:pPr>
         <w:pStyle w:val="Heading1"/>
       </w:pPr>
-      <w:bookmarkStart w:id="4" w:name="_Toc227337358"/>
+      <w:bookmarkStart w:id="4" w:name="_Toc227337847"/>
       <w:r>
         <w:rPr>
           <w:u w:val="single"/>
@@ -3214,7 +4226,6 @@
   <w:style w:type="character" w:default="1" w:styleId="DefaultParagraphFont">
     <w:name w:val="Default Paragraph Font"/>
     <w:uiPriority w:val="1"/>
-    <w:semiHidden/>
     <w:unhideWhenUsed/>
   </w:style>
   <w:style w:type="table" w:default="1" w:styleId="TableNormal">
@@ -3913,12 +4924,6 @@
 </file>
 
 <file path=customXml/item1.xml><?xml version="1.0" encoding="utf-8"?>
-<p:properties xmlns:p="http://schemas.microsoft.com/office/2006/metadata/properties" xmlns:xsi="http://www.w3.org/2001/XMLSchema-instance" xmlns:pc="http://schemas.microsoft.com/office/infopath/2007/PartnerControls">
-  <documentManagement/>
-</p:properties>
-</file>
-
-<file path=customXml/item2.xml><?xml version="1.0" encoding="utf-8"?>
 <?mso-contentType ?>
 <FormTemplates xmlns="http://schemas.microsoft.com/sharepoint/v3/contenttype/forms">
   <Display>DocumentLibraryForm</Display>
@@ -3927,7 +4932,17 @@
 </FormTemplates>
 </file>
 
+<file path=customXml/item2.xml><?xml version="1.0" encoding="utf-8"?>
+<p:properties xmlns:p="http://schemas.microsoft.com/office/2006/metadata/properties" xmlns:xsi="http://www.w3.org/2001/XMLSchema-instance" xmlns:pc="http://schemas.microsoft.com/office/infopath/2007/PartnerControls">
+  <documentManagement/>
+</p:properties>
+</file>
+
 <file path=customXml/item3.xml><?xml version="1.0" encoding="utf-8"?>
+<b:Sources xmlns:b="http://schemas.openxmlformats.org/officeDocument/2006/bibliography" xmlns="http://schemas.openxmlformats.org/officeDocument/2006/bibliography" SelectedStyle="\APASixthEditionOfficeOnline.xsl" StyleName="APA" Version="6"/>
+</file>
+
+<file path=customXml/item4.xml><?xml version="1.0" encoding="utf-8"?>
 <ct:contentTypeSchema xmlns:ct="http://schemas.microsoft.com/office/2006/metadata/contentType" xmlns:ma="http://schemas.microsoft.com/office/2006/metadata/properties/metaAttributes" ct:_="" ma:_="" ma:contentTypeName="Document" ma:contentTypeID="0x0101001C66BFCD16C7B544B0263423A2B0FE8B" ma:contentTypeVersion="10" ma:contentTypeDescription="Create a new document." ma:contentTypeScope="" ma:versionID="16511fcbb737e4c5bd8d2ddcb3bccd57">
   <xsd:schema xmlns:xsd="http://www.w3.org/2001/XMLSchema" xmlns:xs="http://www.w3.org/2001/XMLSchema" xmlns:p="http://schemas.microsoft.com/office/2006/metadata/properties" xmlns:ns3="1d8eb8c9-9bb9-4442-81f3-fb8abfdec0e3" targetNamespace="http://schemas.microsoft.com/office/2006/metadata/properties" ma:root="true" ma:fieldsID="4f195057e8f2e5ff2a3a9caa0b4f5602" ns3:_="">
     <xsd:import namespace="1d8eb8c9-9bb9-4442-81f3-fb8abfdec0e3"/>
@@ -4109,11 +5124,15 @@
 </ct:contentTypeSchema>
 </file>
 
-<file path=customXml/item4.xml><?xml version="1.0" encoding="utf-8"?>
-<b:Sources xmlns:b="http://schemas.openxmlformats.org/officeDocument/2006/bibliography" xmlns="http://schemas.openxmlformats.org/officeDocument/2006/bibliography" SelectedStyle="\APASixthEditionOfficeOnline.xsl" StyleName="APA" Version="6"/>
+<file path=customXml/itemProps1.xml><?xml version="1.0" encoding="utf-8"?>
+<ds:datastoreItem xmlns:ds="http://schemas.openxmlformats.org/officeDocument/2006/customXml" ds:itemID="{8EF46B3D-8B76-4DF0-A0C0-72FC7FEB4B88}">
+  <ds:schemaRefs>
+    <ds:schemaRef ds:uri="http://schemas.microsoft.com/sharepoint/v3/contenttype/forms"/>
+  </ds:schemaRefs>
+</ds:datastoreItem>
 </file>
 
-<file path=customXml/itemProps1.xml><?xml version="1.0" encoding="utf-8"?>
+<file path=customXml/itemProps2.xml><?xml version="1.0" encoding="utf-8"?>
 <ds:datastoreItem xmlns:ds="http://schemas.openxmlformats.org/officeDocument/2006/customXml" ds:itemID="{F49E34C2-C2A7-4675-B990-D89679385CCE}">
   <ds:schemaRefs>
     <ds:schemaRef ds:uri="http://schemas.microsoft.com/office/2006/metadata/properties"/>
@@ -4122,15 +5141,15 @@
 </ds:datastoreItem>
 </file>
 
-<file path=customXml/itemProps2.xml><?xml version="1.0" encoding="utf-8"?>
-<ds:datastoreItem xmlns:ds="http://schemas.openxmlformats.org/officeDocument/2006/customXml" ds:itemID="{8EF46B3D-8B76-4DF0-A0C0-72FC7FEB4B88}">
+<file path=customXml/itemProps3.xml><?xml version="1.0" encoding="utf-8"?>
+<ds:datastoreItem xmlns:ds="http://schemas.openxmlformats.org/officeDocument/2006/customXml" ds:itemID="{6C66B4B9-5056-4708-AC7E-DE2843C7E578}">
   <ds:schemaRefs>
-    <ds:schemaRef ds:uri="http://schemas.microsoft.com/sharepoint/v3/contenttype/forms"/>
+    <ds:schemaRef ds:uri="http://schemas.openxmlformats.org/officeDocument/2006/bibliography"/>
   </ds:schemaRefs>
 </ds:datastoreItem>
 </file>
 
-<file path=customXml/itemProps3.xml><?xml version="1.0" encoding="utf-8"?>
+<file path=customXml/itemProps4.xml><?xml version="1.0" encoding="utf-8"?>
 <ds:datastoreItem xmlns:ds="http://schemas.openxmlformats.org/officeDocument/2006/customXml" ds:itemID="{39D1518B-65BE-4814-92E4-89822390EFD0}">
   <ds:schemaRefs>
     <ds:schemaRef ds:uri="http://schemas.microsoft.com/office/2006/metadata/contentType"/>
@@ -4146,12 +5165,4 @@
     <ds:schemaRef ds:uri="http://schemas.microsoft.com/internal/obd"/>
   </ds:schemaRefs>
 </ds:datastoreItem>
-</file>
-
-<file path=customXml/itemProps4.xml><?xml version="1.0" encoding="utf-8"?>
-<ds:datastoreItem xmlns:ds="http://schemas.openxmlformats.org/officeDocument/2006/customXml" ds:itemID="{6C66B4B9-5056-4708-AC7E-DE2843C7E578}">
-  <ds:schemaRefs>
-    <ds:schemaRef ds:uri="http://schemas.openxmlformats.org/officeDocument/2006/bibliography"/>
-  </ds:schemaRefs>
-</ds:datastoreItem>
 </file>
</xml_diff>

<commit_message>
refected and saw blocks were added after my block in the longest chain meaning my block has been successfully added to the chain
</commit_message>
<xml_diff>
--- a/programming_assignments/PA1/PA1_zuha_aqib_26106.docx
+++ b/programming_assignments/PA1/PA1_zuha_aqib_26106.docx
@@ -300,7 +300,7 @@
           <w:r>
             <w:fldChar w:fldCharType="separate"/>
           </w:r>
-          <w:hyperlink w:anchor="_Toc227337843" w:history="1">
+          <w:hyperlink w:anchor="_Toc227343923" w:history="1">
             <w:r>
               <w:rPr>
                 <w:rStyle w:val="Hyperlink"/>
@@ -327,7 +327,7 @@
                 <w:noProof/>
                 <w:webHidden/>
               </w:rPr>
-              <w:instrText xml:space="preserve"> PAGEREF _Toc227337843 \h </w:instrText>
+              <w:instrText xml:space="preserve"> PAGEREF _Toc227343923 \h </w:instrText>
             </w:r>
             <w:r>
               <w:rPr>
@@ -369,7 +369,7 @@
               <w:noProof/>
             </w:rPr>
           </w:pPr>
-          <w:hyperlink w:anchor="_Toc227337844" w:history="1">
+          <w:hyperlink w:anchor="_Toc227343924" w:history="1">
             <w:r>
               <w:rPr>
                 <w:rStyle w:val="Hyperlink"/>
@@ -396,7 +396,7 @@
                 <w:noProof/>
                 <w:webHidden/>
               </w:rPr>
-              <w:instrText xml:space="preserve"> PAGEREF _Toc227337844 \h </w:instrText>
+              <w:instrText xml:space="preserve"> PAGEREF _Toc227343924 \h </w:instrText>
             </w:r>
             <w:r>
               <w:rPr>
@@ -438,7 +438,7 @@
               <w:noProof/>
             </w:rPr>
           </w:pPr>
-          <w:hyperlink w:anchor="_Toc227337845" w:history="1">
+          <w:hyperlink w:anchor="_Toc227343925" w:history="1">
             <w:r>
               <w:rPr>
                 <w:rStyle w:val="Hyperlink"/>
@@ -465,7 +465,7 @@
                 <w:noProof/>
                 <w:webHidden/>
               </w:rPr>
-              <w:instrText xml:space="preserve"> PAGEREF _Toc227337845 \h </w:instrText>
+              <w:instrText xml:space="preserve"> PAGEREF _Toc227343925 \h </w:instrText>
             </w:r>
             <w:r>
               <w:rPr>
@@ -507,7 +507,7 @@
               <w:noProof/>
             </w:rPr>
           </w:pPr>
-          <w:hyperlink w:anchor="_Toc227337846" w:history="1">
+          <w:hyperlink w:anchor="_Toc227343926" w:history="1">
             <w:r>
               <w:rPr>
                 <w:rStyle w:val="Hyperlink"/>
@@ -534,7 +534,7 @@
                 <w:noProof/>
                 <w:webHidden/>
               </w:rPr>
-              <w:instrText xml:space="preserve"> PAGEREF _Toc227337846 \h </w:instrText>
+              <w:instrText xml:space="preserve"> PAGEREF _Toc227343926 \h </w:instrText>
             </w:r>
             <w:r>
               <w:rPr>
@@ -576,7 +576,7 @@
               <w:noProof/>
             </w:rPr>
           </w:pPr>
-          <w:hyperlink w:anchor="_Toc227337847" w:history="1">
+          <w:hyperlink w:anchor="_Toc227343927" w:history="1">
             <w:r>
               <w:rPr>
                 <w:rStyle w:val="Hyperlink"/>
@@ -603,7 +603,7 @@
                 <w:noProof/>
                 <w:webHidden/>
               </w:rPr>
-              <w:instrText xml:space="preserve"> PAGEREF _Toc227337847 \h </w:instrText>
+              <w:instrText xml:space="preserve"> PAGEREF _Toc227343927 \h </w:instrText>
             </w:r>
             <w:r>
               <w:rPr>
@@ -635,6 +635,75 @@
           </w:hyperlink>
         </w:p>
         <w:p>
+          <w:pPr>
+            <w:pStyle w:val="TOC1"/>
+            <w:tabs>
+              <w:tab w:val="right" w:leader="dot" w:pos="9350"/>
+            </w:tabs>
+            <w:rPr>
+              <w:rFonts w:eastAsiaTheme="minorEastAsia"/>
+              <w:noProof/>
+            </w:rPr>
+          </w:pPr>
+          <w:hyperlink w:anchor="_Toc227343928" w:history="1">
+            <w:r>
+              <w:rPr>
+                <w:rStyle w:val="Hyperlink"/>
+                <w:noProof/>
+              </w:rPr>
+              <w:t>PROOF 6: Blocks added after my block</w:t>
+            </w:r>
+            <w:r>
+              <w:rPr>
+                <w:noProof/>
+                <w:webHidden/>
+              </w:rPr>
+              <w:tab/>
+            </w:r>
+            <w:r>
+              <w:rPr>
+                <w:noProof/>
+                <w:webHidden/>
+              </w:rPr>
+              <w:fldChar w:fldCharType="begin"/>
+            </w:r>
+            <w:r>
+              <w:rPr>
+                <w:noProof/>
+                <w:webHidden/>
+              </w:rPr>
+              <w:instrText xml:space="preserve"> PAGEREF _Toc227343928 \h </w:instrText>
+            </w:r>
+            <w:r>
+              <w:rPr>
+                <w:noProof/>
+                <w:webHidden/>
+              </w:rPr>
+            </w:r>
+            <w:r>
+              <w:rPr>
+                <w:noProof/>
+                <w:webHidden/>
+              </w:rPr>
+              <w:fldChar w:fldCharType="separate"/>
+            </w:r>
+            <w:r>
+              <w:rPr>
+                <w:noProof/>
+                <w:webHidden/>
+              </w:rPr>
+              <w:t>8</w:t>
+            </w:r>
+            <w:r>
+              <w:rPr>
+                <w:noProof/>
+                <w:webHidden/>
+              </w:rPr>
+              <w:fldChar w:fldCharType="end"/>
+            </w:r>
+          </w:hyperlink>
+        </w:p>
+        <w:p>
           <w:r>
             <w:rPr>
               <w:b/>
@@ -676,7 +745,7 @@
       <w:pPr>
         <w:pStyle w:val="Heading1"/>
       </w:pPr>
-      <w:bookmarkStart w:id="0" w:name="_Toc227337843"/>
+      <w:bookmarkStart w:id="0" w:name="_Toc227343923"/>
       <w:r>
         <w:rPr>
           <w:u w:val="single"/>
@@ -1933,7 +2002,7 @@
       <w:pPr>
         <w:pStyle w:val="Heading1"/>
       </w:pPr>
-      <w:bookmarkStart w:id="1" w:name="_Toc227337844"/>
+      <w:bookmarkStart w:id="1" w:name="_Toc227343924"/>
       <w:r>
         <w:rPr>
           <w:u w:val="single"/>
@@ -2504,7 +2573,7 @@
       <w:pPr>
         <w:pStyle w:val="Heading1"/>
       </w:pPr>
-      <w:bookmarkStart w:id="2" w:name="_Toc227337845"/>
+      <w:bookmarkStart w:id="2" w:name="_Toc227343925"/>
       <w:r>
         <w:rPr>
           <w:u w:val="single"/>
@@ -2572,7 +2641,7 @@
       <w:pPr>
         <w:pStyle w:val="Heading1"/>
       </w:pPr>
-      <w:bookmarkStart w:id="3" w:name="_Toc227337846"/>
+      <w:bookmarkStart w:id="3" w:name="_Toc227343926"/>
       <w:r>
         <w:rPr>
           <w:u w:val="single"/>
@@ -3018,7 +3087,7 @@
       <w:pPr>
         <w:pStyle w:val="Heading1"/>
       </w:pPr>
-      <w:bookmarkStart w:id="4" w:name="_Toc227337847"/>
+      <w:bookmarkStart w:id="4" w:name="_Toc227343927"/>
       <w:r>
         <w:rPr>
           <w:u w:val="single"/>
@@ -3543,6 +3612,1207 @@
           <w:szCs w:val="20"/>
         </w:rPr>
         <w:t>total matches = 1</w:t>
+      </w:r>
+    </w:p>
+    <w:p>
+      <w:pPr>
+        <w:rPr>
+          <w:rFonts w:ascii="Times New Roman" w:hAnsi="Times New Roman" w:cs="Times New Roman"/>
+          <w:sz w:val="20"/>
+          <w:szCs w:val="20"/>
+        </w:rPr>
+      </w:pPr>
+    </w:p>
+    <w:p>
+      <w:pPr>
+        <w:pStyle w:val="Heading1"/>
+      </w:pPr>
+      <w:bookmarkStart w:id="5" w:name="_Toc227343928"/>
+      <w:r>
+        <w:rPr>
+          <w:u w:val="single"/>
+        </w:rPr>
+        <w:t>PROOF 6</w:t>
+      </w:r>
+      <w:r>
+        <w:t>: Blocks added after my block</w:t>
+      </w:r>
+      <w:bookmarkEnd w:id="5"/>
+    </w:p>
+    <w:p>
+      <w:pPr>
+        <w:rPr>
+          <w:rFonts w:ascii="Times New Roman" w:hAnsi="Times New Roman" w:cs="Times New Roman"/>
+          <w:sz w:val="20"/>
+          <w:szCs w:val="20"/>
+        </w:rPr>
+      </w:pPr>
+      <w:r>
+        <w:rPr>
+          <w:rFonts w:ascii="Times New Roman" w:hAnsi="Times New Roman" w:cs="Times New Roman"/>
+          <w:sz w:val="20"/>
+          <w:szCs w:val="20"/>
+        </w:rPr>
+        <w:drawing>
+          <wp:inline distT="0" distB="0" distL="0" distR="0" wp14:anchorId="276F7461" wp14:editId="3296FEEB">
+            <wp:extent cx="5943600" cy="2900680"/>
+            <wp:effectExtent l="0" t="0" r="0" b="0"/>
+            <wp:docPr id="344221780" name="Picture 1"/>
+            <wp:cNvGraphicFramePr>
+              <a:graphicFrameLocks xmlns:a="http://schemas.openxmlformats.org/drawingml/2006/main" noChangeAspect="1"/>
+            </wp:cNvGraphicFramePr>
+            <a:graphic xmlns:a="http://schemas.openxmlformats.org/drawingml/2006/main">
+              <a:graphicData uri="http://schemas.openxmlformats.org/drawingml/2006/picture">
+                <pic:pic xmlns:pic="http://schemas.openxmlformats.org/drawingml/2006/picture">
+                  <pic:nvPicPr>
+                    <pic:cNvPr id="344221780" name=""/>
+                    <pic:cNvPicPr/>
+                  </pic:nvPicPr>
+                  <pic:blipFill>
+                    <a:blip r:embed="rId13"/>
+                    <a:stretch>
+                      <a:fillRect/>
+                    </a:stretch>
+                  </pic:blipFill>
+                  <pic:spPr>
+                    <a:xfrm>
+                      <a:off x="0" y="0"/>
+                      <a:ext cx="5943600" cy="2900680"/>
+                    </a:xfrm>
+                    <a:prstGeom prst="rect">
+                      <a:avLst/>
+                    </a:prstGeom>
+                  </pic:spPr>
+                </pic:pic>
+              </a:graphicData>
+            </a:graphic>
+          </wp:inline>
+        </w:drawing>
+      </w:r>
+    </w:p>
+    <w:p>
+      <w:pPr>
+        <w:rPr>
+          <w:rFonts w:ascii="Times New Roman" w:hAnsi="Times New Roman" w:cs="Times New Roman"/>
+          <w:sz w:val="20"/>
+          <w:szCs w:val="20"/>
+        </w:rPr>
+      </w:pPr>
+      <w:r>
+        <w:rPr>
+          <w:rFonts w:ascii="Times New Roman" w:hAnsi="Times New Roman" w:cs="Times New Roman"/>
+          <w:sz w:val="20"/>
+          <w:szCs w:val="20"/>
+        </w:rPr>
+        <w:t>***************************</w:t>
+      </w:r>
+    </w:p>
+    <w:p>
+      <w:pPr>
+        <w:rPr>
+          <w:rFonts w:ascii="Times New Roman" w:hAnsi="Times New Roman" w:cs="Times New Roman"/>
+          <w:sz w:val="20"/>
+          <w:szCs w:val="20"/>
+        </w:rPr>
+      </w:pPr>
+      <w:r>
+        <w:rPr>
+          <w:rFonts w:ascii="Times New Roman" w:hAnsi="Times New Roman" w:cs="Times New Roman"/>
+          <w:sz w:val="20"/>
+          <w:szCs w:val="20"/>
+        </w:rPr>
+        <w:t>Block index # 686</w:t>
+      </w:r>
+    </w:p>
+    <w:p>
+      <w:pPr>
+        <w:rPr>
+          <w:rFonts w:ascii="Times New Roman" w:hAnsi="Times New Roman" w:cs="Times New Roman"/>
+          <w:sz w:val="20"/>
+          <w:szCs w:val="20"/>
+        </w:rPr>
+      </w:pPr>
+      <w:r>
+        <w:rPr>
+          <w:rFonts w:ascii="Times New Roman" w:hAnsi="Times New Roman" w:cs="Times New Roman"/>
+          <w:sz w:val="20"/>
+          <w:szCs w:val="20"/>
+        </w:rPr>
+        <w:t>Transaction number 1263 with hash 85411459801750583924379771724100603743214712645587652217657376285791888971269</w:t>
+      </w:r>
+    </w:p>
+    <w:p>
+      <w:pPr>
+        <w:rPr>
+          <w:rFonts w:ascii="Times New Roman" w:hAnsi="Times New Roman" w:cs="Times New Roman"/>
+          <w:sz w:val="20"/>
+          <w:szCs w:val="20"/>
+        </w:rPr>
+      </w:pPr>
+      <w:r>
+        <w:rPr>
+          <w:rFonts w:ascii="Times New Roman" w:hAnsi="Times New Roman" w:cs="Times New Roman"/>
+          <w:sz w:val="20"/>
+          <w:szCs w:val="20"/>
+        </w:rPr>
+        <w:t>Transaction number 1264 with hash 113608330279527712129199580997234049119827061751021510932869204903405850888594</w:t>
+      </w:r>
+    </w:p>
+    <w:p>
+      <w:pPr>
+        <w:rPr>
+          <w:rFonts w:ascii="Times New Roman" w:hAnsi="Times New Roman" w:cs="Times New Roman"/>
+          <w:sz w:val="20"/>
+          <w:szCs w:val="20"/>
+        </w:rPr>
+      </w:pPr>
+      <w:r>
+        <w:rPr>
+          <w:rFonts w:ascii="Times New Roman" w:hAnsi="Times New Roman" w:cs="Times New Roman"/>
+          <w:sz w:val="20"/>
+          <w:szCs w:val="20"/>
+        </w:rPr>
+        <w:lastRenderedPageBreak/>
+        <w:t>Transaction number 1266 with hash 108026490070220948258683347093258526452013000821197448411100869416388837729223</w:t>
+      </w:r>
+    </w:p>
+    <w:p>
+      <w:pPr>
+        <w:rPr>
+          <w:rFonts w:ascii="Times New Roman" w:hAnsi="Times New Roman" w:cs="Times New Roman"/>
+          <w:sz w:val="20"/>
+          <w:szCs w:val="20"/>
+        </w:rPr>
+      </w:pPr>
+      <w:r>
+        <w:rPr>
+          <w:rFonts w:ascii="Times New Roman" w:hAnsi="Times New Roman" w:cs="Times New Roman"/>
+          <w:sz w:val="20"/>
+          <w:szCs w:val="20"/>
+        </w:rPr>
+        <w:t>Transaction number 1272 with hash 84829507718691180729857441125589395114242926417469530439318821189967110921051</w:t>
+      </w:r>
+    </w:p>
+    <w:p>
+      <w:pPr>
+        <w:rPr>
+          <w:rFonts w:ascii="Times New Roman" w:hAnsi="Times New Roman" w:cs="Times New Roman"/>
+          <w:sz w:val="20"/>
+          <w:szCs w:val="20"/>
+        </w:rPr>
+      </w:pPr>
+      <w:r>
+        <w:rPr>
+          <w:rFonts w:ascii="Times New Roman" w:hAnsi="Times New Roman" w:cs="Times New Roman"/>
+          <w:sz w:val="20"/>
+          <w:szCs w:val="20"/>
+        </w:rPr>
+        <w:t>Transaction number 1275 with hash 100077431043935180347839712544331806663154787643642819051867774084369449362715</w:t>
+      </w:r>
+    </w:p>
+    <w:p>
+      <w:pPr>
+        <w:rPr>
+          <w:rFonts w:ascii="Times New Roman" w:hAnsi="Times New Roman" w:cs="Times New Roman"/>
+          <w:sz w:val="20"/>
+          <w:szCs w:val="20"/>
+        </w:rPr>
+      </w:pPr>
+      <w:r>
+        <w:rPr>
+          <w:rFonts w:ascii="Times New Roman" w:hAnsi="Times New Roman" w:cs="Times New Roman"/>
+          <w:sz w:val="20"/>
+          <w:szCs w:val="20"/>
+        </w:rPr>
+        <w:t>---------------------------</w:t>
+      </w:r>
+    </w:p>
+    <w:p>
+      <w:pPr>
+        <w:rPr>
+          <w:rFonts w:ascii="Times New Roman" w:hAnsi="Times New Roman" w:cs="Times New Roman"/>
+          <w:sz w:val="20"/>
+          <w:szCs w:val="20"/>
+        </w:rPr>
+      </w:pPr>
+      <w:r>
+        <w:rPr>
+          <w:rFonts w:ascii="Times New Roman" w:hAnsi="Times New Roman" w:cs="Times New Roman"/>
+          <w:sz w:val="20"/>
+          <w:szCs w:val="20"/>
+        </w:rPr>
+        <w:t>nonce: 104640</w:t>
+      </w:r>
+    </w:p>
+    <w:p>
+      <w:pPr>
+        <w:rPr>
+          <w:rFonts w:ascii="Times New Roman" w:hAnsi="Times New Roman" w:cs="Times New Roman"/>
+          <w:sz w:val="20"/>
+          <w:szCs w:val="20"/>
+        </w:rPr>
+      </w:pPr>
+      <w:proofErr w:type="spellStart"/>
+      <w:r>
+        <w:rPr>
+          <w:rFonts w:ascii="Times New Roman" w:hAnsi="Times New Roman" w:cs="Times New Roman"/>
+          <w:sz w:val="20"/>
+          <w:szCs w:val="20"/>
+        </w:rPr>
+        <w:t>previous_hash</w:t>
+      </w:r>
+      <w:proofErr w:type="spellEnd"/>
+      <w:r>
+        <w:rPr>
+          <w:rFonts w:ascii="Times New Roman" w:hAnsi="Times New Roman" w:cs="Times New Roman"/>
+          <w:sz w:val="20"/>
+          <w:szCs w:val="20"/>
+        </w:rPr>
+        <w:t>: 00009b1f8dde3823f13d470df1d26b4b76eb4c14a98b451ef98698147c25f719</w:t>
+      </w:r>
+    </w:p>
+    <w:p>
+      <w:pPr>
+        <w:rPr>
+          <w:rFonts w:ascii="Times New Roman" w:hAnsi="Times New Roman" w:cs="Times New Roman"/>
+          <w:sz w:val="20"/>
+          <w:szCs w:val="20"/>
+        </w:rPr>
+      </w:pPr>
+      <w:r>
+        <w:rPr>
+          <w:rFonts w:ascii="Times New Roman" w:hAnsi="Times New Roman" w:cs="Times New Roman"/>
+          <w:sz w:val="20"/>
+          <w:szCs w:val="20"/>
+        </w:rPr>
+        <w:t>hash: 00004a3ec2f86ddc5b0bbe0573d23906e9adbef9d12a552d27b64472b145469c</w:t>
+      </w:r>
+    </w:p>
+    <w:p>
+      <w:pPr>
+        <w:rPr>
+          <w:rFonts w:ascii="Times New Roman" w:hAnsi="Times New Roman" w:cs="Times New Roman"/>
+          <w:sz w:val="20"/>
+          <w:szCs w:val="20"/>
+        </w:rPr>
+      </w:pPr>
+      <w:r>
+        <w:rPr>
+          <w:rFonts w:ascii="Times New Roman" w:hAnsi="Times New Roman" w:cs="Times New Roman"/>
+          <w:sz w:val="20"/>
+          <w:szCs w:val="20"/>
+        </w:rPr>
+        <w:t>Miner: 28991</w:t>
+      </w:r>
+    </w:p>
+    <w:p>
+      <w:pPr>
+        <w:rPr>
+          <w:rFonts w:ascii="Times New Roman" w:hAnsi="Times New Roman" w:cs="Times New Roman"/>
+          <w:sz w:val="20"/>
+          <w:szCs w:val="20"/>
+        </w:rPr>
+      </w:pPr>
+      <w:r>
+        <w:rPr>
+          <w:rFonts w:ascii="Times New Roman" w:hAnsi="Times New Roman" w:cs="Times New Roman"/>
+          <w:sz w:val="20"/>
+          <w:szCs w:val="20"/>
+        </w:rPr>
+        <w:t>***************************</w:t>
+      </w:r>
+    </w:p>
+    <w:p>
+      <w:pPr>
+        <w:rPr>
+          <w:rFonts w:ascii="Times New Roman" w:hAnsi="Times New Roman" w:cs="Times New Roman"/>
+          <w:sz w:val="20"/>
+          <w:szCs w:val="20"/>
+        </w:rPr>
+      </w:pPr>
+    </w:p>
+    <w:p>
+      <w:pPr>
+        <w:rPr>
+          <w:rFonts w:ascii="Times New Roman" w:hAnsi="Times New Roman" w:cs="Times New Roman"/>
+          <w:sz w:val="20"/>
+          <w:szCs w:val="20"/>
+        </w:rPr>
+      </w:pPr>
+      <w:r>
+        <w:rPr>
+          <w:rFonts w:ascii="Times New Roman" w:hAnsi="Times New Roman" w:cs="Times New Roman"/>
+          <w:sz w:val="20"/>
+          <w:szCs w:val="20"/>
+        </w:rPr>
+        <w:t>***************************</w:t>
+      </w:r>
+    </w:p>
+    <w:p>
+      <w:pPr>
+        <w:rPr>
+          <w:rFonts w:ascii="Times New Roman" w:hAnsi="Times New Roman" w:cs="Times New Roman"/>
+          <w:sz w:val="20"/>
+          <w:szCs w:val="20"/>
+        </w:rPr>
+      </w:pPr>
+      <w:r>
+        <w:rPr>
+          <w:rFonts w:ascii="Times New Roman" w:hAnsi="Times New Roman" w:cs="Times New Roman"/>
+          <w:sz w:val="20"/>
+          <w:szCs w:val="20"/>
+        </w:rPr>
+        <w:t>Block index # 687</w:t>
+      </w:r>
+    </w:p>
+    <w:p>
+      <w:pPr>
+        <w:rPr>
+          <w:rFonts w:ascii="Times New Roman" w:hAnsi="Times New Roman" w:cs="Times New Roman"/>
+          <w:sz w:val="20"/>
+          <w:szCs w:val="20"/>
+        </w:rPr>
+      </w:pPr>
+      <w:r>
+        <w:rPr>
+          <w:rFonts w:ascii="Times New Roman" w:hAnsi="Times New Roman" w:cs="Times New Roman"/>
+          <w:sz w:val="20"/>
+          <w:szCs w:val="20"/>
+        </w:rPr>
+        <w:t xml:space="preserve">Transaction number 1276 with </w:t>
+      </w:r>
+      <w:proofErr w:type="gramStart"/>
+      <w:r>
+        <w:rPr>
+          <w:rFonts w:ascii="Times New Roman" w:hAnsi="Times New Roman" w:cs="Times New Roman"/>
+          <w:sz w:val="20"/>
+          <w:szCs w:val="20"/>
+        </w:rPr>
+        <w:t>hash</w:t>
+      </w:r>
+      <w:proofErr w:type="gramEnd"/>
+      <w:r>
+        <w:rPr>
+          <w:rFonts w:ascii="Times New Roman" w:hAnsi="Times New Roman" w:cs="Times New Roman"/>
+          <w:sz w:val="20"/>
+          <w:szCs w:val="20"/>
+        </w:rPr>
+        <w:t xml:space="preserve"> 106897296527924764199667125552980890037746170738505784713432458442547679971572</w:t>
+      </w:r>
+    </w:p>
+    <w:p>
+      <w:pPr>
+        <w:rPr>
+          <w:rFonts w:ascii="Times New Roman" w:hAnsi="Times New Roman" w:cs="Times New Roman"/>
+          <w:sz w:val="20"/>
+          <w:szCs w:val="20"/>
+        </w:rPr>
+      </w:pPr>
+      <w:r>
+        <w:rPr>
+          <w:rFonts w:ascii="Times New Roman" w:hAnsi="Times New Roman" w:cs="Times New Roman"/>
+          <w:sz w:val="20"/>
+          <w:szCs w:val="20"/>
+        </w:rPr>
+        <w:t>Transaction number 1279 with hash 4348696049650101035633769778528607889714584734871062526600404328859556934820</w:t>
+      </w:r>
+    </w:p>
+    <w:p>
+      <w:pPr>
+        <w:rPr>
+          <w:rFonts w:ascii="Times New Roman" w:hAnsi="Times New Roman" w:cs="Times New Roman"/>
+          <w:sz w:val="20"/>
+          <w:szCs w:val="20"/>
+        </w:rPr>
+      </w:pPr>
+      <w:r>
+        <w:rPr>
+          <w:rFonts w:ascii="Times New Roman" w:hAnsi="Times New Roman" w:cs="Times New Roman"/>
+          <w:sz w:val="20"/>
+          <w:szCs w:val="20"/>
+        </w:rPr>
+        <w:t>Transaction number 1283 with hash 15206552066005789095658745641384009236848085361028234329244152637804893412115</w:t>
+      </w:r>
+    </w:p>
+    <w:p>
+      <w:pPr>
+        <w:rPr>
+          <w:rFonts w:ascii="Times New Roman" w:hAnsi="Times New Roman" w:cs="Times New Roman"/>
+          <w:sz w:val="20"/>
+          <w:szCs w:val="20"/>
+        </w:rPr>
+      </w:pPr>
+      <w:r>
+        <w:rPr>
+          <w:rFonts w:ascii="Times New Roman" w:hAnsi="Times New Roman" w:cs="Times New Roman"/>
+          <w:sz w:val="20"/>
+          <w:szCs w:val="20"/>
+        </w:rPr>
+        <w:t>Transaction number 1290 with hash 98690495398309002924443911061725567558432810741273202135647905795356076794112</w:t>
+      </w:r>
+    </w:p>
+    <w:p>
+      <w:pPr>
+        <w:rPr>
+          <w:rFonts w:ascii="Times New Roman" w:hAnsi="Times New Roman" w:cs="Times New Roman"/>
+          <w:sz w:val="20"/>
+          <w:szCs w:val="20"/>
+        </w:rPr>
+      </w:pPr>
+      <w:r>
+        <w:rPr>
+          <w:rFonts w:ascii="Times New Roman" w:hAnsi="Times New Roman" w:cs="Times New Roman"/>
+          <w:sz w:val="20"/>
+          <w:szCs w:val="20"/>
+        </w:rPr>
+        <w:t>Transaction number 1295 with hash 46911183463424891503636513496414637039836375655325814063081513851381921458587</w:t>
+      </w:r>
+    </w:p>
+    <w:p>
+      <w:pPr>
+        <w:rPr>
+          <w:rFonts w:ascii="Times New Roman" w:hAnsi="Times New Roman" w:cs="Times New Roman"/>
+          <w:sz w:val="20"/>
+          <w:szCs w:val="20"/>
+        </w:rPr>
+      </w:pPr>
+      <w:r>
+        <w:rPr>
+          <w:rFonts w:ascii="Times New Roman" w:hAnsi="Times New Roman" w:cs="Times New Roman"/>
+          <w:sz w:val="20"/>
+          <w:szCs w:val="20"/>
+        </w:rPr>
+        <w:t>---------------------------</w:t>
+      </w:r>
+    </w:p>
+    <w:p>
+      <w:pPr>
+        <w:rPr>
+          <w:rFonts w:ascii="Times New Roman" w:hAnsi="Times New Roman" w:cs="Times New Roman"/>
+          <w:sz w:val="20"/>
+          <w:szCs w:val="20"/>
+        </w:rPr>
+      </w:pPr>
+      <w:r>
+        <w:rPr>
+          <w:rFonts w:ascii="Times New Roman" w:hAnsi="Times New Roman" w:cs="Times New Roman"/>
+          <w:sz w:val="20"/>
+          <w:szCs w:val="20"/>
+        </w:rPr>
+        <w:t>nonce: 1300460</w:t>
+      </w:r>
+    </w:p>
+    <w:p>
+      <w:pPr>
+        <w:rPr>
+          <w:rFonts w:ascii="Times New Roman" w:hAnsi="Times New Roman" w:cs="Times New Roman"/>
+          <w:sz w:val="20"/>
+          <w:szCs w:val="20"/>
+        </w:rPr>
+      </w:pPr>
+      <w:proofErr w:type="spellStart"/>
+      <w:r>
+        <w:rPr>
+          <w:rFonts w:ascii="Times New Roman" w:hAnsi="Times New Roman" w:cs="Times New Roman"/>
+          <w:sz w:val="20"/>
+          <w:szCs w:val="20"/>
+        </w:rPr>
+        <w:t>previous_hash</w:t>
+      </w:r>
+      <w:proofErr w:type="spellEnd"/>
+      <w:r>
+        <w:rPr>
+          <w:rFonts w:ascii="Times New Roman" w:hAnsi="Times New Roman" w:cs="Times New Roman"/>
+          <w:sz w:val="20"/>
+          <w:szCs w:val="20"/>
+        </w:rPr>
+        <w:t>: 00004a3ec2f86ddc5b0bbe0573d23906e9adbef9d12a552d27b64472b145469c</w:t>
+      </w:r>
+    </w:p>
+    <w:p>
+      <w:pPr>
+        <w:rPr>
+          <w:rFonts w:ascii="Times New Roman" w:hAnsi="Times New Roman" w:cs="Times New Roman"/>
+          <w:sz w:val="20"/>
+          <w:szCs w:val="20"/>
+        </w:rPr>
+      </w:pPr>
+      <w:r>
+        <w:rPr>
+          <w:rFonts w:ascii="Times New Roman" w:hAnsi="Times New Roman" w:cs="Times New Roman"/>
+          <w:sz w:val="20"/>
+          <w:szCs w:val="20"/>
+        </w:rPr>
+        <w:t>hash: 0000c88055d80223236e80abbffc460a381b0a5e0d492ca30f722e9ccf74b1b3</w:t>
+      </w:r>
+    </w:p>
+    <w:p>
+      <w:pPr>
+        <w:rPr>
+          <w:rFonts w:ascii="Times New Roman" w:hAnsi="Times New Roman" w:cs="Times New Roman"/>
+          <w:sz w:val="20"/>
+          <w:szCs w:val="20"/>
+        </w:rPr>
+      </w:pPr>
+      <w:r>
+        <w:rPr>
+          <w:rFonts w:ascii="Times New Roman" w:hAnsi="Times New Roman" w:cs="Times New Roman"/>
+          <w:sz w:val="20"/>
+          <w:szCs w:val="20"/>
+        </w:rPr>
+        <w:t>Miner: 26106</w:t>
+      </w:r>
+    </w:p>
+    <w:p>
+      <w:pPr>
+        <w:rPr>
+          <w:rFonts w:ascii="Times New Roman" w:hAnsi="Times New Roman" w:cs="Times New Roman"/>
+          <w:sz w:val="20"/>
+          <w:szCs w:val="20"/>
+        </w:rPr>
+      </w:pPr>
+      <w:r>
+        <w:rPr>
+          <w:rFonts w:ascii="Times New Roman" w:hAnsi="Times New Roman" w:cs="Times New Roman"/>
+          <w:sz w:val="20"/>
+          <w:szCs w:val="20"/>
+        </w:rPr>
+        <w:t>***************************</w:t>
+      </w:r>
+    </w:p>
+    <w:p>
+      <w:pPr>
+        <w:rPr>
+          <w:rFonts w:ascii="Times New Roman" w:hAnsi="Times New Roman" w:cs="Times New Roman"/>
+          <w:sz w:val="20"/>
+          <w:szCs w:val="20"/>
+        </w:rPr>
+      </w:pPr>
+    </w:p>
+    <w:p>
+      <w:pPr>
+        <w:rPr>
+          <w:rFonts w:ascii="Times New Roman" w:hAnsi="Times New Roman" w:cs="Times New Roman"/>
+          <w:sz w:val="20"/>
+          <w:szCs w:val="20"/>
+        </w:rPr>
+      </w:pPr>
+      <w:r>
+        <w:rPr>
+          <w:rFonts w:ascii="Times New Roman" w:hAnsi="Times New Roman" w:cs="Times New Roman"/>
+          <w:sz w:val="20"/>
+          <w:szCs w:val="20"/>
+        </w:rPr>
+        <w:t>***************************</w:t>
+      </w:r>
+    </w:p>
+    <w:p>
+      <w:pPr>
+        <w:rPr>
+          <w:rFonts w:ascii="Times New Roman" w:hAnsi="Times New Roman" w:cs="Times New Roman"/>
+          <w:sz w:val="20"/>
+          <w:szCs w:val="20"/>
+        </w:rPr>
+      </w:pPr>
+      <w:r>
+        <w:rPr>
+          <w:rFonts w:ascii="Times New Roman" w:hAnsi="Times New Roman" w:cs="Times New Roman"/>
+          <w:sz w:val="20"/>
+          <w:szCs w:val="20"/>
+        </w:rPr>
+        <w:lastRenderedPageBreak/>
+        <w:t>Block index # 688</w:t>
+      </w:r>
+    </w:p>
+    <w:p>
+      <w:pPr>
+        <w:rPr>
+          <w:rFonts w:ascii="Times New Roman" w:hAnsi="Times New Roman" w:cs="Times New Roman"/>
+          <w:sz w:val="20"/>
+          <w:szCs w:val="20"/>
+        </w:rPr>
+      </w:pPr>
+      <w:r>
+        <w:rPr>
+          <w:rFonts w:ascii="Times New Roman" w:hAnsi="Times New Roman" w:cs="Times New Roman"/>
+          <w:sz w:val="20"/>
+          <w:szCs w:val="20"/>
+        </w:rPr>
+        <w:t>Transaction number 1296 with hash 58987023161446331021402941306404632760026750423800979600783589351279961143360</w:t>
+      </w:r>
+    </w:p>
+    <w:p>
+      <w:pPr>
+        <w:rPr>
+          <w:rFonts w:ascii="Times New Roman" w:hAnsi="Times New Roman" w:cs="Times New Roman"/>
+          <w:sz w:val="20"/>
+          <w:szCs w:val="20"/>
+        </w:rPr>
+      </w:pPr>
+      <w:r>
+        <w:rPr>
+          <w:rFonts w:ascii="Times New Roman" w:hAnsi="Times New Roman" w:cs="Times New Roman"/>
+          <w:sz w:val="20"/>
+          <w:szCs w:val="20"/>
+        </w:rPr>
+        <w:t>Transaction number 1298 with hash 8373493932771146940734093892759598869715673982991167397736691856870244968422</w:t>
+      </w:r>
+    </w:p>
+    <w:p>
+      <w:pPr>
+        <w:rPr>
+          <w:rFonts w:ascii="Times New Roman" w:hAnsi="Times New Roman" w:cs="Times New Roman"/>
+          <w:sz w:val="20"/>
+          <w:szCs w:val="20"/>
+        </w:rPr>
+      </w:pPr>
+      <w:r>
+        <w:rPr>
+          <w:rFonts w:ascii="Times New Roman" w:hAnsi="Times New Roman" w:cs="Times New Roman"/>
+          <w:sz w:val="20"/>
+          <w:szCs w:val="20"/>
+        </w:rPr>
+        <w:t>Transaction number 1299 with hash 14291103965669749236736710049936839502406721666023804922010695810444918711410</w:t>
+      </w:r>
+    </w:p>
+    <w:p>
+      <w:pPr>
+        <w:rPr>
+          <w:rFonts w:ascii="Times New Roman" w:hAnsi="Times New Roman" w:cs="Times New Roman"/>
+          <w:sz w:val="20"/>
+          <w:szCs w:val="20"/>
+        </w:rPr>
+      </w:pPr>
+      <w:r>
+        <w:rPr>
+          <w:rFonts w:ascii="Times New Roman" w:hAnsi="Times New Roman" w:cs="Times New Roman"/>
+          <w:sz w:val="20"/>
+          <w:szCs w:val="20"/>
+        </w:rPr>
+        <w:t>Transaction number 1300 with hash 78376476006371406786409599878621206075103688154040114009748082934149395746142</w:t>
+      </w:r>
+    </w:p>
+    <w:p>
+      <w:pPr>
+        <w:rPr>
+          <w:rFonts w:ascii="Times New Roman" w:hAnsi="Times New Roman" w:cs="Times New Roman"/>
+          <w:sz w:val="20"/>
+          <w:szCs w:val="20"/>
+        </w:rPr>
+      </w:pPr>
+      <w:r>
+        <w:rPr>
+          <w:rFonts w:ascii="Times New Roman" w:hAnsi="Times New Roman" w:cs="Times New Roman"/>
+          <w:sz w:val="20"/>
+          <w:szCs w:val="20"/>
+        </w:rPr>
+        <w:t>Transaction number 1302 with hash 98625460474457581848192473545597839122007619385678105446656565126418251611628</w:t>
+      </w:r>
+    </w:p>
+    <w:p>
+      <w:pPr>
+        <w:rPr>
+          <w:rFonts w:ascii="Times New Roman" w:hAnsi="Times New Roman" w:cs="Times New Roman"/>
+          <w:sz w:val="20"/>
+          <w:szCs w:val="20"/>
+        </w:rPr>
+      </w:pPr>
+      <w:r>
+        <w:rPr>
+          <w:rFonts w:ascii="Times New Roman" w:hAnsi="Times New Roman" w:cs="Times New Roman"/>
+          <w:sz w:val="20"/>
+          <w:szCs w:val="20"/>
+        </w:rPr>
+        <w:t>---------------------------</w:t>
+      </w:r>
+    </w:p>
+    <w:p>
+      <w:pPr>
+        <w:rPr>
+          <w:rFonts w:ascii="Times New Roman" w:hAnsi="Times New Roman" w:cs="Times New Roman"/>
+          <w:sz w:val="20"/>
+          <w:szCs w:val="20"/>
+        </w:rPr>
+      </w:pPr>
+      <w:r>
+        <w:rPr>
+          <w:rFonts w:ascii="Times New Roman" w:hAnsi="Times New Roman" w:cs="Times New Roman"/>
+          <w:sz w:val="20"/>
+          <w:szCs w:val="20"/>
+        </w:rPr>
+        <w:t>nonce: 497270</w:t>
+      </w:r>
+    </w:p>
+    <w:p>
+      <w:pPr>
+        <w:rPr>
+          <w:rFonts w:ascii="Times New Roman" w:hAnsi="Times New Roman" w:cs="Times New Roman"/>
+          <w:sz w:val="20"/>
+          <w:szCs w:val="20"/>
+          <w:lang w:val="es-ES"/>
+        </w:rPr>
+      </w:pPr>
+      <w:proofErr w:type="spellStart"/>
+      <w:r>
+        <w:rPr>
+          <w:rFonts w:ascii="Times New Roman" w:hAnsi="Times New Roman" w:cs="Times New Roman"/>
+          <w:sz w:val="20"/>
+          <w:szCs w:val="20"/>
+          <w:lang w:val="es-ES"/>
+        </w:rPr>
+        <w:t>previous_hash</w:t>
+      </w:r>
+      <w:proofErr w:type="spellEnd"/>
+      <w:r>
+        <w:rPr>
+          <w:rFonts w:ascii="Times New Roman" w:hAnsi="Times New Roman" w:cs="Times New Roman"/>
+          <w:sz w:val="20"/>
+          <w:szCs w:val="20"/>
+          <w:lang w:val="es-ES"/>
+        </w:rPr>
+        <w:t>: 0000c88055d80223236e80abbffc460a381b0a5e0d492ca30f722e9ccf74b1b3</w:t>
+      </w:r>
+    </w:p>
+    <w:p>
+      <w:pPr>
+        <w:rPr>
+          <w:rFonts w:ascii="Times New Roman" w:hAnsi="Times New Roman" w:cs="Times New Roman"/>
+          <w:sz w:val="20"/>
+          <w:szCs w:val="20"/>
+          <w:lang w:val="es-ES"/>
+        </w:rPr>
+      </w:pPr>
+      <w:r>
+        <w:rPr>
+          <w:rFonts w:ascii="Times New Roman" w:hAnsi="Times New Roman" w:cs="Times New Roman"/>
+          <w:sz w:val="20"/>
+          <w:szCs w:val="20"/>
+          <w:lang w:val="es-ES"/>
+        </w:rPr>
+        <w:t>hash: 0000aade5e23a1f5e5be8a1a531fa5c7c3cba06dfad395e2c97f43d20c2e40bf</w:t>
+      </w:r>
+    </w:p>
+    <w:p>
+      <w:pPr>
+        <w:rPr>
+          <w:rFonts w:ascii="Times New Roman" w:hAnsi="Times New Roman" w:cs="Times New Roman"/>
+          <w:sz w:val="20"/>
+          <w:szCs w:val="20"/>
+          <w:lang w:val="es-ES"/>
+        </w:rPr>
+      </w:pPr>
+      <w:r>
+        <w:rPr>
+          <w:rFonts w:ascii="Times New Roman" w:hAnsi="Times New Roman" w:cs="Times New Roman"/>
+          <w:sz w:val="20"/>
+          <w:szCs w:val="20"/>
+          <w:lang w:val="es-ES"/>
+        </w:rPr>
+        <w:t>Miner: 26956</w:t>
+      </w:r>
+    </w:p>
+    <w:p>
+      <w:pPr>
+        <w:rPr>
+          <w:rFonts w:ascii="Times New Roman" w:hAnsi="Times New Roman" w:cs="Times New Roman"/>
+          <w:sz w:val="20"/>
+          <w:szCs w:val="20"/>
+        </w:rPr>
+      </w:pPr>
+      <w:r>
+        <w:rPr>
+          <w:rFonts w:ascii="Times New Roman" w:hAnsi="Times New Roman" w:cs="Times New Roman"/>
+          <w:sz w:val="20"/>
+          <w:szCs w:val="20"/>
+        </w:rPr>
+        <w:t>***************************</w:t>
+      </w:r>
+    </w:p>
+    <w:p>
+      <w:pPr>
+        <w:rPr>
+          <w:rFonts w:ascii="Times New Roman" w:hAnsi="Times New Roman" w:cs="Times New Roman"/>
+          <w:sz w:val="20"/>
+          <w:szCs w:val="20"/>
+        </w:rPr>
+      </w:pPr>
+    </w:p>
+    <w:p>
+      <w:pPr>
+        <w:rPr>
+          <w:rFonts w:ascii="Times New Roman" w:hAnsi="Times New Roman" w:cs="Times New Roman"/>
+          <w:sz w:val="20"/>
+          <w:szCs w:val="20"/>
+        </w:rPr>
+      </w:pPr>
+      <w:r>
+        <w:rPr>
+          <w:rFonts w:ascii="Times New Roman" w:hAnsi="Times New Roman" w:cs="Times New Roman"/>
+          <w:sz w:val="20"/>
+          <w:szCs w:val="20"/>
+        </w:rPr>
+        <w:t>***************************</w:t>
+      </w:r>
+    </w:p>
+    <w:p>
+      <w:pPr>
+        <w:rPr>
+          <w:rFonts w:ascii="Times New Roman" w:hAnsi="Times New Roman" w:cs="Times New Roman"/>
+          <w:sz w:val="20"/>
+          <w:szCs w:val="20"/>
+        </w:rPr>
+      </w:pPr>
+      <w:r>
+        <w:rPr>
+          <w:rFonts w:ascii="Times New Roman" w:hAnsi="Times New Roman" w:cs="Times New Roman"/>
+          <w:sz w:val="20"/>
+          <w:szCs w:val="20"/>
+        </w:rPr>
+        <w:t>Block index # 689</w:t>
+      </w:r>
+    </w:p>
+    <w:p>
+      <w:pPr>
+        <w:rPr>
+          <w:rFonts w:ascii="Times New Roman" w:hAnsi="Times New Roman" w:cs="Times New Roman"/>
+          <w:sz w:val="20"/>
+          <w:szCs w:val="20"/>
+        </w:rPr>
+      </w:pPr>
+      <w:r>
+        <w:rPr>
+          <w:rFonts w:ascii="Times New Roman" w:hAnsi="Times New Roman" w:cs="Times New Roman"/>
+          <w:sz w:val="20"/>
+          <w:szCs w:val="20"/>
+        </w:rPr>
+        <w:t xml:space="preserve">Transaction number 1308 with </w:t>
+      </w:r>
+      <w:proofErr w:type="gramStart"/>
+      <w:r>
+        <w:rPr>
+          <w:rFonts w:ascii="Times New Roman" w:hAnsi="Times New Roman" w:cs="Times New Roman"/>
+          <w:sz w:val="20"/>
+          <w:szCs w:val="20"/>
+        </w:rPr>
+        <w:t>hash</w:t>
+      </w:r>
+      <w:proofErr w:type="gramEnd"/>
+      <w:r>
+        <w:rPr>
+          <w:rFonts w:ascii="Times New Roman" w:hAnsi="Times New Roman" w:cs="Times New Roman"/>
+          <w:sz w:val="20"/>
+          <w:szCs w:val="20"/>
+        </w:rPr>
+        <w:t xml:space="preserve"> 31759150156224767616442148047435086625994287837022129046828002942296729197176</w:t>
+      </w:r>
+    </w:p>
+    <w:p>
+      <w:pPr>
+        <w:rPr>
+          <w:rFonts w:ascii="Times New Roman" w:hAnsi="Times New Roman" w:cs="Times New Roman"/>
+          <w:sz w:val="20"/>
+          <w:szCs w:val="20"/>
+        </w:rPr>
+      </w:pPr>
+      <w:r>
+        <w:rPr>
+          <w:rFonts w:ascii="Times New Roman" w:hAnsi="Times New Roman" w:cs="Times New Roman"/>
+          <w:sz w:val="20"/>
+          <w:szCs w:val="20"/>
+        </w:rPr>
+        <w:t>Transaction number 1309 with hash 56632493402093467299129210384003882649703508759723019171271524851781926133904</w:t>
+      </w:r>
+    </w:p>
+    <w:p>
+      <w:pPr>
+        <w:rPr>
+          <w:rFonts w:ascii="Times New Roman" w:hAnsi="Times New Roman" w:cs="Times New Roman"/>
+          <w:sz w:val="20"/>
+          <w:szCs w:val="20"/>
+        </w:rPr>
+      </w:pPr>
+      <w:r>
+        <w:rPr>
+          <w:rFonts w:ascii="Times New Roman" w:hAnsi="Times New Roman" w:cs="Times New Roman"/>
+          <w:sz w:val="20"/>
+          <w:szCs w:val="20"/>
+        </w:rPr>
+        <w:t>Transaction number 1314 with hash 14291353302511323610882808553071384971982812012778503574391875536993893082315</w:t>
+      </w:r>
+    </w:p>
+    <w:p>
+      <w:pPr>
+        <w:rPr>
+          <w:rFonts w:ascii="Times New Roman" w:hAnsi="Times New Roman" w:cs="Times New Roman"/>
+          <w:sz w:val="20"/>
+          <w:szCs w:val="20"/>
+        </w:rPr>
+      </w:pPr>
+      <w:r>
+        <w:rPr>
+          <w:rFonts w:ascii="Times New Roman" w:hAnsi="Times New Roman" w:cs="Times New Roman"/>
+          <w:sz w:val="20"/>
+          <w:szCs w:val="20"/>
+        </w:rPr>
+        <w:t xml:space="preserve">Transaction number 1316 with </w:t>
+      </w:r>
+      <w:proofErr w:type="gramStart"/>
+      <w:r>
+        <w:rPr>
+          <w:rFonts w:ascii="Times New Roman" w:hAnsi="Times New Roman" w:cs="Times New Roman"/>
+          <w:sz w:val="20"/>
+          <w:szCs w:val="20"/>
+        </w:rPr>
+        <w:t>hash</w:t>
+      </w:r>
+      <w:proofErr w:type="gramEnd"/>
+      <w:r>
+        <w:rPr>
+          <w:rFonts w:ascii="Times New Roman" w:hAnsi="Times New Roman" w:cs="Times New Roman"/>
+          <w:sz w:val="20"/>
+          <w:szCs w:val="20"/>
+        </w:rPr>
+        <w:t xml:space="preserve"> 55410992612947734630846407697823499849137451586003889981216754956938491180134</w:t>
+      </w:r>
+    </w:p>
+    <w:p>
+      <w:pPr>
+        <w:rPr>
+          <w:rFonts w:ascii="Times New Roman" w:hAnsi="Times New Roman" w:cs="Times New Roman"/>
+          <w:sz w:val="20"/>
+          <w:szCs w:val="20"/>
+        </w:rPr>
+      </w:pPr>
+      <w:r>
+        <w:rPr>
+          <w:rFonts w:ascii="Times New Roman" w:hAnsi="Times New Roman" w:cs="Times New Roman"/>
+          <w:sz w:val="20"/>
+          <w:szCs w:val="20"/>
+        </w:rPr>
+        <w:t>Transaction number 1319 with hash 51205624483406576833616732064705841873609002274412221812223173010432674767866</w:t>
+      </w:r>
+    </w:p>
+    <w:p>
+      <w:pPr>
+        <w:rPr>
+          <w:rFonts w:ascii="Times New Roman" w:hAnsi="Times New Roman" w:cs="Times New Roman"/>
+          <w:sz w:val="20"/>
+          <w:szCs w:val="20"/>
+        </w:rPr>
+      </w:pPr>
+      <w:r>
+        <w:rPr>
+          <w:rFonts w:ascii="Times New Roman" w:hAnsi="Times New Roman" w:cs="Times New Roman"/>
+          <w:sz w:val="20"/>
+          <w:szCs w:val="20"/>
+        </w:rPr>
+        <w:t>---------------------------</w:t>
+      </w:r>
+    </w:p>
+    <w:p>
+      <w:pPr>
+        <w:rPr>
+          <w:rFonts w:ascii="Times New Roman" w:hAnsi="Times New Roman" w:cs="Times New Roman"/>
+          <w:sz w:val="20"/>
+          <w:szCs w:val="20"/>
+        </w:rPr>
+      </w:pPr>
+      <w:r>
+        <w:rPr>
+          <w:rFonts w:ascii="Times New Roman" w:hAnsi="Times New Roman" w:cs="Times New Roman"/>
+          <w:sz w:val="20"/>
+          <w:szCs w:val="20"/>
+        </w:rPr>
+        <w:t>nonce: 249030</w:t>
+      </w:r>
+    </w:p>
+    <w:p>
+      <w:pPr>
+        <w:rPr>
+          <w:rFonts w:ascii="Times New Roman" w:hAnsi="Times New Roman" w:cs="Times New Roman"/>
+          <w:sz w:val="20"/>
+          <w:szCs w:val="20"/>
+        </w:rPr>
+      </w:pPr>
+      <w:proofErr w:type="spellStart"/>
+      <w:r>
+        <w:rPr>
+          <w:rFonts w:ascii="Times New Roman" w:hAnsi="Times New Roman" w:cs="Times New Roman"/>
+          <w:sz w:val="20"/>
+          <w:szCs w:val="20"/>
+        </w:rPr>
+        <w:t>previous_hash</w:t>
+      </w:r>
+      <w:proofErr w:type="spellEnd"/>
+      <w:r>
+        <w:rPr>
+          <w:rFonts w:ascii="Times New Roman" w:hAnsi="Times New Roman" w:cs="Times New Roman"/>
+          <w:sz w:val="20"/>
+          <w:szCs w:val="20"/>
+        </w:rPr>
+        <w:t>: 0000aade5e23a1f5e5be8a1a531fa5c7c3cba06dfad395e2c97f43d20c2e40bf</w:t>
+      </w:r>
+    </w:p>
+    <w:p>
+      <w:pPr>
+        <w:rPr>
+          <w:rFonts w:ascii="Times New Roman" w:hAnsi="Times New Roman" w:cs="Times New Roman"/>
+          <w:sz w:val="20"/>
+          <w:szCs w:val="20"/>
+        </w:rPr>
+      </w:pPr>
+      <w:r>
+        <w:rPr>
+          <w:rFonts w:ascii="Times New Roman" w:hAnsi="Times New Roman" w:cs="Times New Roman"/>
+          <w:sz w:val="20"/>
+          <w:szCs w:val="20"/>
+        </w:rPr>
+        <w:t>hash: 00007425b5be884130e621a70af6ce4baf0ff11c72adb026fbb4ae688ee69ead</w:t>
+      </w:r>
+    </w:p>
+    <w:p>
+      <w:pPr>
+        <w:rPr>
+          <w:rFonts w:ascii="Times New Roman" w:hAnsi="Times New Roman" w:cs="Times New Roman"/>
+          <w:sz w:val="20"/>
+          <w:szCs w:val="20"/>
+        </w:rPr>
+      </w:pPr>
+      <w:r>
+        <w:rPr>
+          <w:rFonts w:ascii="Times New Roman" w:hAnsi="Times New Roman" w:cs="Times New Roman"/>
+          <w:sz w:val="20"/>
+          <w:szCs w:val="20"/>
+        </w:rPr>
+        <w:lastRenderedPageBreak/>
+        <w:t>Miner: 26906</w:t>
+      </w:r>
+    </w:p>
+    <w:p>
+      <w:pPr>
+        <w:rPr>
+          <w:rFonts w:ascii="Times New Roman" w:hAnsi="Times New Roman" w:cs="Times New Roman"/>
+          <w:sz w:val="20"/>
+          <w:szCs w:val="20"/>
+        </w:rPr>
+      </w:pPr>
+      <w:r>
+        <w:rPr>
+          <w:rFonts w:ascii="Times New Roman" w:hAnsi="Times New Roman" w:cs="Times New Roman"/>
+          <w:sz w:val="20"/>
+          <w:szCs w:val="20"/>
+        </w:rPr>
+        <w:t>***************************</w:t>
+      </w:r>
+    </w:p>
+    <w:p>
+      <w:pPr>
+        <w:rPr>
+          <w:rFonts w:ascii="Times New Roman" w:hAnsi="Times New Roman" w:cs="Times New Roman"/>
+          <w:sz w:val="20"/>
+          <w:szCs w:val="20"/>
+        </w:rPr>
+      </w:pPr>
+    </w:p>
+    <w:p>
+      <w:pPr>
+        <w:rPr>
+          <w:rFonts w:ascii="Times New Roman" w:hAnsi="Times New Roman" w:cs="Times New Roman"/>
+          <w:sz w:val="20"/>
+          <w:szCs w:val="20"/>
+        </w:rPr>
+      </w:pPr>
+      <w:r>
+        <w:rPr>
+          <w:rFonts w:ascii="Times New Roman" w:hAnsi="Times New Roman" w:cs="Times New Roman"/>
+          <w:sz w:val="20"/>
+          <w:szCs w:val="20"/>
+        </w:rPr>
+        <w:t>&gt;</w:t>
+      </w:r>
+    </w:p>
+    <w:p>
+      <w:pPr>
+        <w:rPr>
+          <w:rFonts w:ascii="Times New Roman" w:hAnsi="Times New Roman" w:cs="Times New Roman"/>
+          <w:sz w:val="20"/>
+          <w:szCs w:val="20"/>
+        </w:rPr>
+      </w:pPr>
+    </w:p>
+    <w:p>
+      <w:pPr>
+        <w:rPr>
+          <w:rFonts w:ascii="Times New Roman" w:hAnsi="Times New Roman" w:cs="Times New Roman"/>
+          <w:i/>
+          <w:iCs/>
+          <w:sz w:val="20"/>
+          <w:szCs w:val="20"/>
+        </w:rPr>
+      </w:pPr>
+      <w:proofErr w:type="gramStart"/>
+      <w:r>
+        <w:rPr>
+          <w:rFonts w:ascii="Times New Roman" w:hAnsi="Times New Roman" w:cs="Times New Roman"/>
+          <w:i/>
+          <w:iCs/>
+          <w:sz w:val="20"/>
+          <w:szCs w:val="20"/>
+        </w:rPr>
+        <w:t>so</w:t>
+      </w:r>
+      <w:proofErr w:type="gramEnd"/>
+      <w:r>
+        <w:rPr>
+          <w:rFonts w:ascii="Times New Roman" w:hAnsi="Times New Roman" w:cs="Times New Roman"/>
+          <w:i/>
+          <w:iCs/>
+          <w:sz w:val="20"/>
+          <w:szCs w:val="20"/>
+        </w:rPr>
+        <w:t xml:space="preserve"> after doing “</w:t>
+      </w:r>
+      <w:proofErr w:type="spellStart"/>
+      <w:r>
+        <w:rPr>
+          <w:rFonts w:ascii="Times New Roman" w:hAnsi="Times New Roman" w:cs="Times New Roman"/>
+          <w:i/>
+          <w:iCs/>
+          <w:sz w:val="20"/>
+          <w:szCs w:val="20"/>
+        </w:rPr>
+        <w:t>rl</w:t>
+      </w:r>
+      <w:proofErr w:type="spellEnd"/>
+      <w:r>
+        <w:rPr>
+          <w:rFonts w:ascii="Times New Roman" w:hAnsi="Times New Roman" w:cs="Times New Roman"/>
+          <w:i/>
+          <w:iCs/>
+          <w:sz w:val="20"/>
+          <w:szCs w:val="20"/>
+        </w:rPr>
+        <w:t>” and “validate”</w:t>
+      </w:r>
+      <w:r>
+        <w:rPr>
+          <w:rFonts w:ascii="Times New Roman" w:hAnsi="Times New Roman" w:cs="Times New Roman"/>
+          <w:i/>
+          <w:iCs/>
+          <w:sz w:val="20"/>
+          <w:szCs w:val="20"/>
+        </w:rPr>
+        <w:t xml:space="preserve"> after a couple of hours</w:t>
+      </w:r>
+      <w:r>
+        <w:rPr>
+          <w:rFonts w:ascii="Times New Roman" w:hAnsi="Times New Roman" w:cs="Times New Roman"/>
+          <w:i/>
+          <w:iCs/>
+          <w:sz w:val="20"/>
+          <w:szCs w:val="20"/>
+        </w:rPr>
+        <w:t>, we see that more blocks have been added after my block from different ERPs meaning my block has been accepted by the system and is included in the longest chain successfully.</w:t>
       </w:r>
     </w:p>
     <w:p>
@@ -4226,6 +5496,7 @@
   <w:style w:type="character" w:default="1" w:styleId="DefaultParagraphFont">
     <w:name w:val="Default Paragraph Font"/>
     <w:uiPriority w:val="1"/>
+    <w:semiHidden/>
     <w:unhideWhenUsed/>
   </w:style>
   <w:style w:type="table" w:default="1" w:styleId="TableNormal">
@@ -4924,6 +6195,12 @@
 </file>
 
 <file path=customXml/item1.xml><?xml version="1.0" encoding="utf-8"?>
+<p:properties xmlns:p="http://schemas.microsoft.com/office/2006/metadata/properties" xmlns:xsi="http://www.w3.org/2001/XMLSchema-instance" xmlns:pc="http://schemas.microsoft.com/office/infopath/2007/PartnerControls">
+  <documentManagement/>
+</p:properties>
+</file>
+
+<file path=customXml/item2.xml><?xml version="1.0" encoding="utf-8"?>
 <?mso-contentType ?>
 <FormTemplates xmlns="http://schemas.microsoft.com/sharepoint/v3/contenttype/forms">
   <Display>DocumentLibraryForm</Display>
@@ -4932,17 +6209,7 @@
 </FormTemplates>
 </file>
 
-<file path=customXml/item2.xml><?xml version="1.0" encoding="utf-8"?>
-<p:properties xmlns:p="http://schemas.microsoft.com/office/2006/metadata/properties" xmlns:xsi="http://www.w3.org/2001/XMLSchema-instance" xmlns:pc="http://schemas.microsoft.com/office/infopath/2007/PartnerControls">
-  <documentManagement/>
-</p:properties>
-</file>
-
 <file path=customXml/item3.xml><?xml version="1.0" encoding="utf-8"?>
-<b:Sources xmlns:b="http://schemas.openxmlformats.org/officeDocument/2006/bibliography" xmlns="http://schemas.openxmlformats.org/officeDocument/2006/bibliography" SelectedStyle="\APASixthEditionOfficeOnline.xsl" StyleName="APA" Version="6"/>
-</file>
-
-<file path=customXml/item4.xml><?xml version="1.0" encoding="utf-8"?>
 <ct:contentTypeSchema xmlns:ct="http://schemas.microsoft.com/office/2006/metadata/contentType" xmlns:ma="http://schemas.microsoft.com/office/2006/metadata/properties/metaAttributes" ct:_="" ma:_="" ma:contentTypeName="Document" ma:contentTypeID="0x0101001C66BFCD16C7B544B0263423A2B0FE8B" ma:contentTypeVersion="10" ma:contentTypeDescription="Create a new document." ma:contentTypeScope="" ma:versionID="16511fcbb737e4c5bd8d2ddcb3bccd57">
   <xsd:schema xmlns:xsd="http://www.w3.org/2001/XMLSchema" xmlns:xs="http://www.w3.org/2001/XMLSchema" xmlns:p="http://schemas.microsoft.com/office/2006/metadata/properties" xmlns:ns3="1d8eb8c9-9bb9-4442-81f3-fb8abfdec0e3" targetNamespace="http://schemas.microsoft.com/office/2006/metadata/properties" ma:root="true" ma:fieldsID="4f195057e8f2e5ff2a3a9caa0b4f5602" ns3:_="">
     <xsd:import namespace="1d8eb8c9-9bb9-4442-81f3-fb8abfdec0e3"/>
@@ -5124,15 +6391,11 @@
 </ct:contentTypeSchema>
 </file>
 
-<file path=customXml/itemProps1.xml><?xml version="1.0" encoding="utf-8"?>
-<ds:datastoreItem xmlns:ds="http://schemas.openxmlformats.org/officeDocument/2006/customXml" ds:itemID="{8EF46B3D-8B76-4DF0-A0C0-72FC7FEB4B88}">
-  <ds:schemaRefs>
-    <ds:schemaRef ds:uri="http://schemas.microsoft.com/sharepoint/v3/contenttype/forms"/>
-  </ds:schemaRefs>
-</ds:datastoreItem>
+<file path=customXml/item4.xml><?xml version="1.0" encoding="utf-8"?>
+<b:Sources xmlns:b="http://schemas.openxmlformats.org/officeDocument/2006/bibliography" xmlns="http://schemas.openxmlformats.org/officeDocument/2006/bibliography" SelectedStyle="\APASixthEditionOfficeOnline.xsl" StyleName="APA" Version="6"/>
 </file>
 
-<file path=customXml/itemProps2.xml><?xml version="1.0" encoding="utf-8"?>
+<file path=customXml/itemProps1.xml><?xml version="1.0" encoding="utf-8"?>
 <ds:datastoreItem xmlns:ds="http://schemas.openxmlformats.org/officeDocument/2006/customXml" ds:itemID="{F49E34C2-C2A7-4675-B990-D89679385CCE}">
   <ds:schemaRefs>
     <ds:schemaRef ds:uri="http://schemas.microsoft.com/office/2006/metadata/properties"/>
@@ -5141,15 +6404,15 @@
 </ds:datastoreItem>
 </file>
 
-<file path=customXml/itemProps3.xml><?xml version="1.0" encoding="utf-8"?>
-<ds:datastoreItem xmlns:ds="http://schemas.openxmlformats.org/officeDocument/2006/customXml" ds:itemID="{6C66B4B9-5056-4708-AC7E-DE2843C7E578}">
+<file path=customXml/itemProps2.xml><?xml version="1.0" encoding="utf-8"?>
+<ds:datastoreItem xmlns:ds="http://schemas.openxmlformats.org/officeDocument/2006/customXml" ds:itemID="{8EF46B3D-8B76-4DF0-A0C0-72FC7FEB4B88}">
   <ds:schemaRefs>
-    <ds:schemaRef ds:uri="http://schemas.openxmlformats.org/officeDocument/2006/bibliography"/>
+    <ds:schemaRef ds:uri="http://schemas.microsoft.com/sharepoint/v3/contenttype/forms"/>
   </ds:schemaRefs>
 </ds:datastoreItem>
 </file>
 
-<file path=customXml/itemProps4.xml><?xml version="1.0" encoding="utf-8"?>
+<file path=customXml/itemProps3.xml><?xml version="1.0" encoding="utf-8"?>
 <ds:datastoreItem xmlns:ds="http://schemas.openxmlformats.org/officeDocument/2006/customXml" ds:itemID="{39D1518B-65BE-4814-92E4-89822390EFD0}">
   <ds:schemaRefs>
     <ds:schemaRef ds:uri="http://schemas.microsoft.com/office/2006/metadata/contentType"/>
@@ -5165,4 +6428,12 @@
     <ds:schemaRef ds:uri="http://schemas.microsoft.com/internal/obd"/>
   </ds:schemaRefs>
 </ds:datastoreItem>
+</file>
+
+<file path=customXml/itemProps4.xml><?xml version="1.0" encoding="utf-8"?>
+<ds:datastoreItem xmlns:ds="http://schemas.openxmlformats.org/officeDocument/2006/customXml" ds:itemID="{6C66B4B9-5056-4708-AC7E-DE2843C7E578}">
+  <ds:schemaRefs>
+    <ds:schemaRef ds:uri="http://schemas.openxmlformats.org/officeDocument/2006/bibliography"/>
+  </ds:schemaRefs>
+</ds:datastoreItem>
 </file>
</xml_diff>